<commit_message>
skyflex.au — docx: remove yellow existing-content sections (new content only), change heading tags to H1:/H2:/H3: with colon
</commit_message>
<xml_diff>
--- a/clients/skyflex.au/content/exports/delivery-2026-07-16T05-22/skyflex-content-deliverable.docx
+++ b/clients/skyflex.au/content/exports/delivery-2026-07-16T05-22/skyflex-content-deliverable.docx
@@ -13,24 +13,7 @@
     </w:p>
     <w:p>
       <w:r>
-        <w:t>7 pages. Headings are tagged H1/H2/H3 and bold, at the same size as body text, so the developer can apply the correct heading level. FAQ questions are H3. Existing page content that is kept is highlighted yellow. Internal links are live hyperlinks. Generated 2026-07-16.</w:t>
-      </w:r>
-    </w:p>
-    <w:p>
-      <w:r>
-        <w:rPr>
-          <w:b/>
-        </w:rPr>
-        <w:t xml:space="preserve">Legend: </w:t>
-      </w:r>
-      <w:r>
-        <w:t xml:space="preserve">plain = new content to add.  </w:t>
-      </w:r>
-      <w:r>
-        <w:rPr>
-          <w:highlight w:val="yellow"/>
-        </w:rPr>
-        <w:t>yellow = existing content on the live page, keep as-is.</w:t>
+        <w:t>7 pages. Headings are tagged H1:/H2:/H3: and bold, at the same size as body text, so the developer can apply the correct heading level. FAQ questions are H3. Internal links are live hyperlinks. Generated 2026-07-16.</w:t>
       </w:r>
     </w:p>
     <w:p>
@@ -102,9 +85,9 @@
     <w:p>
       <w:r>
         <w:rPr>
-          <w:b/>
-        </w:rPr>
-        <w:t>NEW CONTENT (add these sections; they lead the page):</w:t>
+          <w:i/>
+        </w:rPr>
+        <w:t>Add-blocks: these sections are added to the existing page (existing content stays).</w:t>
       </w:r>
     </w:p>
     <w:p>
@@ -116,7 +99,7 @@
           <w:b/>
           <w:color w:val="888888"/>
         </w:rPr>
-        <w:t xml:space="preserve">H1 </w:t>
+        <w:t xml:space="preserve">H1: </w:t>
       </w:r>
       <w:r>
         <w:rPr>
@@ -174,7 +157,7 @@
           <w:b/>
           <w:color w:val="888888"/>
         </w:rPr>
-        <w:t xml:space="preserve">H2 </w:t>
+        <w:t xml:space="preserve">H2: </w:t>
       </w:r>
       <w:r>
         <w:rPr>
@@ -330,7 +313,7 @@
           <w:b/>
           <w:color w:val="888888"/>
         </w:rPr>
-        <w:t xml:space="preserve">H2 </w:t>
+        <w:t xml:space="preserve">H2: </w:t>
       </w:r>
       <w:r>
         <w:rPr>
@@ -414,614 +397,6 @@
           <w:b w:val="0"/>
         </w:rPr>
         <w:t xml:space="preserve"> to get started.</w:t>
-      </w:r>
-    </w:p>
-    <w:p/>
-    <w:p>
-      <w:r>
-        <w:rPr>
-          <w:b/>
-          <w:highlight w:val="yellow"/>
-        </w:rPr>
-        <w:t>EXISTING PAGE CONTENT BELOW — keep as-is (highlighted yellow):</w:t>
-      </w:r>
-    </w:p>
-    <w:p>
-      <w:r>
-        <w:rPr>
-          <w:i/>
-        </w:rPr>
-        <w:t>Note: the new sections above supply the page H1. Demote the existing H1 below to H2 so the page has a single H1. On the Sydney page also fix the 'designs and installs' intro, the skyflex.com.au link and the Melbourne phone; rename any 'Why Choose SkyFlex' heading; fill or remove empty U6/U7 grid tiles.</w:t>
-      </w:r>
-    </w:p>
-    <w:p>
-      <w:r>
-        <w:rPr>
-          <w:b/>
-        </w:rPr>
-        <w:t xml:space="preserve">Current SEO title: </w:t>
-      </w:r>
-      <w:r>
-        <w:rPr>
-          <w:highlight w:val="yellow"/>
-        </w:rPr>
-        <w:t>Louvred Pergolas Melbourne - Premium Louvred Pergolas for Sale | Skyflex</w:t>
-      </w:r>
-      <w:r>
-        <w:t xml:space="preserve">  (replace with the new SEO title above)</w:t>
-      </w:r>
-    </w:p>
-    <w:p>
-      <w:pPr>
-        <w:spacing w:before="160" w:after="40"/>
-      </w:pPr>
-      <w:r>
-        <w:rPr>
-          <w:b/>
-          <w:color w:val="888888"/>
-          <w:highlight w:val="yellow"/>
-        </w:rPr>
-        <w:t xml:space="preserve">H2 </w:t>
-      </w:r>
-      <w:r>
-        <w:rPr>
-          <w:b/>
-          <w:highlight w:val="yellow"/>
-        </w:rPr>
-        <w:t>DELTA OPENSKY</w:t>
-      </w:r>
-    </w:p>
-    <w:p>
-      <w:pPr>
-        <w:spacing w:before="160" w:after="40"/>
-      </w:pPr>
-      <w:r>
-        <w:rPr>
-          <w:b/>
-          <w:color w:val="888888"/>
-          <w:highlight w:val="yellow"/>
-        </w:rPr>
-        <w:t xml:space="preserve">H2 </w:t>
-      </w:r>
-      <w:r>
-        <w:rPr>
-          <w:b/>
-          <w:highlight w:val="yellow"/>
-        </w:rPr>
-        <w:t>DELTA MOTORISED</w:t>
-      </w:r>
-    </w:p>
-    <w:p>
-      <w:pPr>
-        <w:spacing w:before="160" w:after="40"/>
-      </w:pPr>
-      <w:r>
-        <w:rPr>
-          <w:b/>
-          <w:color w:val="888888"/>
-          <w:highlight w:val="yellow"/>
-        </w:rPr>
-        <w:t xml:space="preserve">H2 </w:t>
-      </w:r>
-      <w:r>
-        <w:rPr>
-          <w:b/>
-          <w:highlight w:val="yellow"/>
-        </w:rPr>
-        <w:t>DELTA LIGHT MOTORISED</w:t>
-      </w:r>
-    </w:p>
-    <w:p>
-      <w:pPr>
-        <w:spacing w:before="160" w:after="40"/>
-      </w:pPr>
-      <w:r>
-        <w:rPr>
-          <w:b/>
-          <w:color w:val="888888"/>
-          <w:highlight w:val="yellow"/>
-        </w:rPr>
-        <w:t xml:space="preserve">H1 </w:t>
-      </w:r>
-      <w:r>
-        <w:rPr>
-          <w:b/>
-          <w:highlight w:val="yellow"/>
-        </w:rPr>
-        <w:t>Louvred Pergolas Melbourne</w:t>
-      </w:r>
-    </w:p>
-    <w:p>
-      <w:pPr>
-        <w:spacing w:before="160" w:after="40"/>
-      </w:pPr>
-      <w:r>
-        <w:rPr>
-          <w:b/>
-          <w:color w:val="888888"/>
-          <w:highlight w:val="yellow"/>
-        </w:rPr>
-        <w:t xml:space="preserve">H2 </w:t>
-      </w:r>
-      <w:r>
-        <w:rPr>
-          <w:b/>
-          <w:highlight w:val="yellow"/>
-        </w:rPr>
-        <w:t>Our Products</w:t>
-      </w:r>
-    </w:p>
-    <w:p>
-      <w:pPr>
-        <w:spacing w:before="160" w:after="40"/>
-      </w:pPr>
-      <w:r>
-        <w:rPr>
-          <w:b/>
-          <w:color w:val="888888"/>
-          <w:highlight w:val="yellow"/>
-        </w:rPr>
-        <w:t xml:space="preserve">H2 </w:t>
-      </w:r>
-      <w:r>
-        <w:rPr>
-          <w:b/>
-          <w:highlight w:val="yellow"/>
-        </w:rPr>
-        <w:t>Delta Light Motorised (Base Model)</w:t>
-      </w:r>
-    </w:p>
-    <w:p>
-      <w:pPr>
-        <w:spacing w:before="160" w:after="40"/>
-      </w:pPr>
-      <w:r>
-        <w:rPr>
-          <w:b/>
-          <w:color w:val="888888"/>
-          <w:highlight w:val="yellow"/>
-        </w:rPr>
-        <w:t xml:space="preserve">H2 </w:t>
-      </w:r>
-      <w:r>
-        <w:rPr>
-          <w:b/>
-          <w:highlight w:val="yellow"/>
-        </w:rPr>
-        <w:t>Delta Motorised Aluminium Louvred Pergola (Mid-Range Model)</w:t>
-      </w:r>
-    </w:p>
-    <w:p>
-      <w:pPr>
-        <w:spacing w:before="160" w:after="40"/>
-      </w:pPr>
-      <w:r>
-        <w:rPr>
-          <w:b/>
-          <w:color w:val="888888"/>
-          <w:highlight w:val="yellow"/>
-        </w:rPr>
-        <w:t xml:space="preserve">H2 </w:t>
-      </w:r>
-      <w:r>
-        <w:rPr>
-          <w:b/>
-          <w:highlight w:val="yellow"/>
-        </w:rPr>
-        <w:t>Delta Open Sky Motorised Aluminium Louvred Pergola (Mid-Range Model)</w:t>
-      </w:r>
-    </w:p>
-    <w:p>
-      <w:pPr>
-        <w:spacing w:before="160" w:after="40"/>
-      </w:pPr>
-      <w:r>
-        <w:rPr>
-          <w:b/>
-          <w:color w:val="888888"/>
-          <w:highlight w:val="yellow"/>
-        </w:rPr>
-        <w:t xml:space="preserve">H2 </w:t>
-      </w:r>
-      <w:r>
-        <w:rPr>
-          <w:b/>
-          <w:highlight w:val="yellow"/>
-        </w:rPr>
-        <w:t>Delta Pro Retractable Roof</w:t>
-      </w:r>
-    </w:p>
-    <w:p>
-      <w:pPr>
-        <w:spacing w:before="160" w:after="40"/>
-      </w:pPr>
-      <w:r>
-        <w:rPr>
-          <w:b/>
-          <w:color w:val="888888"/>
-          <w:highlight w:val="yellow"/>
-        </w:rPr>
-        <w:t xml:space="preserve">H2 </w:t>
-      </w:r>
-      <w:r>
-        <w:rPr>
-          <w:b/>
-          <w:highlight w:val="yellow"/>
-        </w:rPr>
-        <w:t>Delta Commercial Folding Arm</w:t>
-      </w:r>
-    </w:p>
-    <w:p>
-      <w:pPr>
-        <w:spacing w:before="160" w:after="40"/>
-      </w:pPr>
-      <w:r>
-        <w:rPr>
-          <w:b/>
-          <w:color w:val="888888"/>
-          <w:highlight w:val="yellow"/>
-        </w:rPr>
-        <w:t xml:space="preserve">H2 </w:t>
-      </w:r>
-      <w:r>
-        <w:rPr>
-          <w:b/>
-          <w:highlight w:val="yellow"/>
-        </w:rPr>
-        <w:t>Delta Elevating Pool &amp; Spa Cover</w:t>
-      </w:r>
-    </w:p>
-    <w:p>
-      <w:pPr>
-        <w:spacing w:before="160" w:after="40"/>
-      </w:pPr>
-      <w:r>
-        <w:rPr>
-          <w:b/>
-          <w:color w:val="888888"/>
-          <w:highlight w:val="yellow"/>
-        </w:rPr>
-        <w:t xml:space="preserve">H2 </w:t>
-      </w:r>
-      <w:r>
-        <w:rPr>
-          <w:b/>
-          <w:highlight w:val="yellow"/>
-        </w:rPr>
-        <w:t>Delta Roller Pool &amp; Spa Cover</w:t>
-      </w:r>
-    </w:p>
-    <w:p>
-      <w:pPr>
-        <w:spacing w:before="160" w:after="40"/>
-      </w:pPr>
-      <w:r>
-        <w:rPr>
-          <w:b/>
-          <w:color w:val="888888"/>
-          <w:highlight w:val="yellow"/>
-        </w:rPr>
-        <w:t xml:space="preserve">H2 </w:t>
-      </w:r>
-      <w:r>
-        <w:rPr>
-          <w:b/>
-          <w:highlight w:val="yellow"/>
-        </w:rPr>
-        <w:t>SKYFLEX 4K Android Smart Outdoor Tv</w:t>
-      </w:r>
-    </w:p>
-    <w:p>
-      <w:pPr>
-        <w:spacing w:before="160" w:after="40"/>
-      </w:pPr>
-      <w:r>
-        <w:rPr>
-          <w:b/>
-          <w:color w:val="888888"/>
-          <w:highlight w:val="yellow"/>
-        </w:rPr>
-        <w:t xml:space="preserve">H2 </w:t>
-      </w:r>
-      <w:r>
-        <w:rPr>
-          <w:b/>
-          <w:highlight w:val="yellow"/>
-        </w:rPr>
-        <w:t>SKYFLEX BBQ Pods</w:t>
-      </w:r>
-    </w:p>
-    <w:p>
-      <w:pPr>
-        <w:spacing w:before="160" w:after="40"/>
-      </w:pPr>
-      <w:r>
-        <w:rPr>
-          <w:b/>
-          <w:color w:val="888888"/>
-          <w:highlight w:val="yellow"/>
-        </w:rPr>
-        <w:t xml:space="preserve">H2 </w:t>
-      </w:r>
-      <w:r>
-        <w:rPr>
-          <w:b/>
-          <w:highlight w:val="yellow"/>
-        </w:rPr>
-        <w:t>U6 Smartoilet</w:t>
-      </w:r>
-    </w:p>
-    <w:p>
-      <w:pPr>
-        <w:spacing w:before="160" w:after="40"/>
-      </w:pPr>
-      <w:r>
-        <w:rPr>
-          <w:b/>
-          <w:color w:val="888888"/>
-          <w:highlight w:val="yellow"/>
-        </w:rPr>
-        <w:t xml:space="preserve">H2 </w:t>
-      </w:r>
-      <w:r>
-        <w:rPr>
-          <w:b/>
-          <w:highlight w:val="yellow"/>
-        </w:rPr>
-        <w:t>U7 Smartoilet</w:t>
-      </w:r>
-    </w:p>
-    <w:p>
-      <w:pPr>
-        <w:spacing w:before="160" w:after="40"/>
-      </w:pPr>
-      <w:r>
-        <w:rPr>
-          <w:b/>
-          <w:color w:val="888888"/>
-          <w:highlight w:val="yellow"/>
-        </w:rPr>
-        <w:t xml:space="preserve">H2 </w:t>
-      </w:r>
-      <w:r>
-        <w:rPr>
-          <w:b/>
-          <w:highlight w:val="yellow"/>
-        </w:rPr>
-        <w:t>Why Choose SkyFlex for Louvred Pergolas in Melbourne?</w:t>
-      </w:r>
-    </w:p>
-    <w:p>
-      <w:pPr>
-        <w:spacing w:before="160" w:after="40"/>
-      </w:pPr>
-      <w:r>
-        <w:rPr>
-          <w:b/>
-          <w:color w:val="888888"/>
-          <w:highlight w:val="yellow"/>
-        </w:rPr>
-        <w:t xml:space="preserve">H2 </w:t>
-      </w:r>
-      <w:r>
-        <w:rPr>
-          <w:b/>
-          <w:highlight w:val="yellow"/>
-        </w:rPr>
-        <w:t>Louvred Roof Pergolas in Melbourne – Enhance Your Outdoor Living</w:t>
-      </w:r>
-    </w:p>
-    <w:p>
-      <w:pPr>
-        <w:spacing w:before="160" w:after="40"/>
-      </w:pPr>
-      <w:r>
-        <w:rPr>
-          <w:b/>
-          <w:color w:val="888888"/>
-          <w:highlight w:val="yellow"/>
-        </w:rPr>
-        <w:t xml:space="preserve">H2 </w:t>
-      </w:r>
-      <w:r>
-        <w:rPr>
-          <w:b/>
-          <w:highlight w:val="yellow"/>
-        </w:rPr>
-        <w:t>Premium Louvred Pergolas for Sale in Melbourne</w:t>
-      </w:r>
-    </w:p>
-    <w:p>
-      <w:pPr>
-        <w:spacing w:before="160" w:after="40"/>
-      </w:pPr>
-      <w:r>
-        <w:rPr>
-          <w:b/>
-          <w:color w:val="888888"/>
-          <w:highlight w:val="yellow"/>
-        </w:rPr>
-        <w:t xml:space="preserve">H3 </w:t>
-      </w:r>
-      <w:r>
-        <w:rPr>
-          <w:b/>
-          <w:highlight w:val="yellow"/>
-        </w:rPr>
-        <w:t>SkyFlex vs. Others</w:t>
-      </w:r>
-    </w:p>
-    <w:p>
-      <w:pPr>
-        <w:spacing w:before="160" w:after="40"/>
-      </w:pPr>
-      <w:r>
-        <w:rPr>
-          <w:b/>
-          <w:color w:val="888888"/>
-          <w:highlight w:val="yellow"/>
-        </w:rPr>
-        <w:t xml:space="preserve">H3 </w:t>
-      </w:r>
-      <w:r>
-        <w:rPr>
-          <w:b/>
-          <w:highlight w:val="yellow"/>
-        </w:rPr>
-        <w:t>Up to 8x cheaper</w:t>
-      </w:r>
-    </w:p>
-    <w:p>
-      <w:pPr>
-        <w:spacing w:before="160" w:after="40"/>
-      </w:pPr>
-      <w:r>
-        <w:rPr>
-          <w:b/>
-          <w:color w:val="888888"/>
-          <w:highlight w:val="yellow"/>
-        </w:rPr>
-        <w:t xml:space="preserve">H3 </w:t>
-      </w:r>
-      <w:r>
-        <w:rPr>
-          <w:b/>
-          <w:highlight w:val="yellow"/>
-        </w:rPr>
-        <w:t>The traditional Skyflex Way</w:t>
-      </w:r>
-    </w:p>
-    <w:p>
-      <w:pPr>
-        <w:spacing w:before="160" w:after="40"/>
-      </w:pPr>
-      <w:r>
-        <w:rPr>
-          <w:b/>
-          <w:color w:val="888888"/>
-          <w:highlight w:val="yellow"/>
-        </w:rPr>
-        <w:t xml:space="preserve">H3 </w:t>
-      </w:r>
-      <w:r>
-        <w:rPr>
-          <w:b/>
-          <w:highlight w:val="yellow"/>
-        </w:rPr>
-        <w:t>What Our Clients Say About Us</w:t>
-      </w:r>
-    </w:p>
-    <w:p>
-      <w:pPr>
-        <w:spacing w:before="160" w:after="40"/>
-      </w:pPr>
-      <w:r>
-        <w:rPr>
-          <w:b/>
-          <w:color w:val="888888"/>
-          <w:highlight w:val="yellow"/>
-        </w:rPr>
-        <w:t xml:space="preserve">H2 </w:t>
-      </w:r>
-      <w:r>
-        <w:rPr>
-          <w:b/>
-          <w:highlight w:val="yellow"/>
-        </w:rPr>
-        <w:t>Buy Louvred Pergolas in Melbourne from SkyFlex</w:t>
-      </w:r>
-    </w:p>
-    <w:p>
-      <w:pPr>
-        <w:spacing w:before="160" w:after="40"/>
-      </w:pPr>
-      <w:r>
-        <w:rPr>
-          <w:b/>
-          <w:color w:val="888888"/>
-          <w:highlight w:val="yellow"/>
-        </w:rPr>
-        <w:t xml:space="preserve">H2 </w:t>
-      </w:r>
-      <w:r>
-        <w:rPr>
-          <w:b/>
-          <w:highlight w:val="yellow"/>
-        </w:rPr>
-        <w:t>Frequently Asked Questions About Louvred Pergolas in Melbourne</w:t>
-      </w:r>
-    </w:p>
-    <w:p>
-      <w:pPr>
-        <w:spacing w:before="160" w:after="40"/>
-      </w:pPr>
-      <w:r>
-        <w:rPr>
-          <w:b/>
-          <w:color w:val="888888"/>
-          <w:highlight w:val="yellow"/>
-        </w:rPr>
-        <w:t xml:space="preserve">H3 </w:t>
-      </w:r>
-      <w:r>
-        <w:rPr>
-          <w:b/>
-          <w:highlight w:val="yellow"/>
-        </w:rPr>
-        <w:t>Talk to our Australian Team</w:t>
-      </w:r>
-    </w:p>
-    <w:p>
-      <w:r>
-        <w:rPr>
-          <w:b/>
-        </w:rPr>
-        <w:t>Sample of existing body copy (kept):</w:t>
-      </w:r>
-    </w:p>
-    <w:p>
-      <w:r>
-        <w:rPr>
-          <w:b w:val="0"/>
-          <w:highlight w:val="yellow"/>
-        </w:rPr>
-        <w:t>Sorry, this product is unavailable. Please choose a different combination.</w:t>
-      </w:r>
-    </w:p>
-    <w:p>
-      <w:r>
-        <w:rPr>
-          <w:b w:val="0"/>
-          <w:highlight w:val="yellow"/>
-        </w:rPr>
-        <w:t>HAVE A ALL YEAR ROUND OUTDOOR SPACE STARTING FROM JUST $12,150*</w:t>
-      </w:r>
-    </w:p>
-    <w:p>
-      <w:r>
-        <w:rPr>
-          <w:b w:val="0"/>
-          <w:highlight w:val="yellow"/>
-        </w:rPr>
-        <w:t>ORDER ONLINE OR GET IN TOUCH FOR YOUR CUSTOM PROJECT!</w:t>
-      </w:r>
-    </w:p>
-    <w:p>
-      <w:r>
-        <w:rPr>
-          <w:b w:val="0"/>
-          <w:highlight w:val="yellow"/>
-        </w:rPr>
-        <w:t>DESIGNED FOR HIGH END APPLICATIONS &amp; FULLY CUSTOMISABLE TO ANY SIZE, SETTING &amp; COLOUR!</w:t>
-      </w:r>
-    </w:p>
-    <w:p>
-      <w:r>
-        <w:rPr>
-          <w:b w:val="0"/>
-          <w:highlight w:val="yellow"/>
-        </w:rPr>
-        <w:t>HAVE ALL YEAR ROUND OUTDOOR SPACES STARTING FROM JUST $4950*</w:t>
       </w:r>
     </w:p>
     <w:p>
@@ -1093,9 +468,9 @@
     <w:p>
       <w:r>
         <w:rPr>
-          <w:b/>
-        </w:rPr>
-        <w:t>NEW CONTENT (add these sections; they lead the page):</w:t>
+          <w:i/>
+        </w:rPr>
+        <w:t>Add-blocks: these sections are added to the existing page (existing content stays).</w:t>
       </w:r>
     </w:p>
     <w:p>
@@ -1107,7 +482,7 @@
           <w:b/>
           <w:color w:val="888888"/>
         </w:rPr>
-        <w:t xml:space="preserve">H1 </w:t>
+        <w:t xml:space="preserve">H1: </w:t>
       </w:r>
       <w:r>
         <w:rPr>
@@ -1165,7 +540,7 @@
           <w:b/>
           <w:color w:val="888888"/>
         </w:rPr>
-        <w:t xml:space="preserve">H2 </w:t>
+        <w:t xml:space="preserve">H2: </w:t>
       </w:r>
       <w:r>
         <w:rPr>
@@ -1225,7 +600,7 @@
           <w:b/>
           <w:color w:val="888888"/>
         </w:rPr>
-        <w:t xml:space="preserve">H2 </w:t>
+        <w:t xml:space="preserve">H2: </w:t>
       </w:r>
       <w:r>
         <w:rPr>
@@ -1282,814 +657,6 @@
         <w:t xml:space="preserve"> to get started.</w:t>
       </w:r>
     </w:p>
-    <w:p/>
-    <w:p>
-      <w:r>
-        <w:rPr>
-          <w:b/>
-          <w:highlight w:val="yellow"/>
-        </w:rPr>
-        <w:t>EXISTING PAGE CONTENT BELOW — keep as-is (highlighted yellow):</w:t>
-      </w:r>
-    </w:p>
-    <w:p>
-      <w:r>
-        <w:rPr>
-          <w:i/>
-        </w:rPr>
-        <w:t>Note: the new sections above supply the page H1. Demote the existing H1 below to H2 so the page has a single H1. On the Sydney page also fix the 'designs and installs' intro, the skyflex.com.au link and the Melbourne phone; rename any 'Why Choose SkyFlex' heading; fill or remove empty U6/U7 grid tiles.</w:t>
-      </w:r>
-    </w:p>
-    <w:p>
-      <w:r>
-        <w:rPr>
-          <w:b/>
-        </w:rPr>
-        <w:t xml:space="preserve">Current SEO title: </w:t>
-      </w:r>
-      <w:r>
-        <w:rPr>
-          <w:highlight w:val="yellow"/>
-        </w:rPr>
-        <w:t>Louvred Pergolas Sydney | Top Louvred Roof Pergolas | Skyflex</w:t>
-      </w:r>
-      <w:r>
-        <w:t xml:space="preserve">  (replace with the new SEO title above)</w:t>
-      </w:r>
-    </w:p>
-    <w:p>
-      <w:pPr>
-        <w:spacing w:before="160" w:after="40"/>
-      </w:pPr>
-      <w:r>
-        <w:rPr>
-          <w:b/>
-          <w:color w:val="888888"/>
-          <w:highlight w:val="yellow"/>
-        </w:rPr>
-        <w:t xml:space="preserve">H1 </w:t>
-      </w:r>
-      <w:r>
-        <w:rPr>
-          <w:b/>
-          <w:highlight w:val="yellow"/>
-        </w:rPr>
-        <w:t>LOUVRED PERGOLAS SYDNEY</w:t>
-      </w:r>
-    </w:p>
-    <w:p>
-      <w:pPr>
-        <w:spacing w:before="160" w:after="40"/>
-      </w:pPr>
-      <w:r>
-        <w:rPr>
-          <w:b/>
-          <w:color w:val="888888"/>
-          <w:highlight w:val="yellow"/>
-        </w:rPr>
-        <w:t xml:space="preserve">H2 </w:t>
-      </w:r>
-      <w:r>
-        <w:rPr>
-          <w:b/>
-          <w:highlight w:val="yellow"/>
-        </w:rPr>
-        <w:t>OUR PRODUCTS</w:t>
-      </w:r>
-    </w:p>
-    <w:p>
-      <w:pPr>
-        <w:spacing w:before="160" w:after="40"/>
-      </w:pPr>
-      <w:r>
-        <w:rPr>
-          <w:b/>
-          <w:color w:val="888888"/>
-          <w:highlight w:val="yellow"/>
-        </w:rPr>
-        <w:t xml:space="preserve">H2 </w:t>
-      </w:r>
-      <w:r>
-        <w:rPr>
-          <w:b/>
-          <w:highlight w:val="yellow"/>
-        </w:rPr>
-        <w:t>DELTA OPEN SKY MOTORISED ALUMINIUM LOUVRED PERGOLA (MID-RANGE MODEL)</w:t>
-      </w:r>
-    </w:p>
-    <w:p>
-      <w:pPr>
-        <w:spacing w:before="160" w:after="40"/>
-      </w:pPr>
-      <w:r>
-        <w:rPr>
-          <w:b/>
-          <w:color w:val="888888"/>
-          <w:highlight w:val="yellow"/>
-        </w:rPr>
-        <w:t xml:space="preserve">H2 </w:t>
-      </w:r>
-      <w:r>
-        <w:rPr>
-          <w:b/>
-          <w:highlight w:val="yellow"/>
-        </w:rPr>
-        <w:t>DELTA PRO RETRACTABLE ROOF</w:t>
-      </w:r>
-    </w:p>
-    <w:p>
-      <w:pPr>
-        <w:spacing w:before="160" w:after="40"/>
-      </w:pPr>
-      <w:r>
-        <w:rPr>
-          <w:b/>
-          <w:color w:val="888888"/>
-          <w:highlight w:val="yellow"/>
-        </w:rPr>
-        <w:t xml:space="preserve">H2 </w:t>
-      </w:r>
-      <w:r>
-        <w:rPr>
-          <w:b/>
-          <w:highlight w:val="yellow"/>
-        </w:rPr>
-        <w:t>DELTA LIGHT MOTORISED (BASE MODEL)</w:t>
-      </w:r>
-    </w:p>
-    <w:p>
-      <w:pPr>
-        <w:spacing w:before="160" w:after="40"/>
-      </w:pPr>
-      <w:r>
-        <w:rPr>
-          <w:b/>
-          <w:color w:val="888888"/>
-          <w:highlight w:val="yellow"/>
-        </w:rPr>
-        <w:t xml:space="preserve">H2 </w:t>
-      </w:r>
-      <w:r>
-        <w:rPr>
-          <w:b/>
-          <w:highlight w:val="yellow"/>
-        </w:rPr>
-        <w:t>DELTA MOTORISED ALUMINIUM LOUVRED PERGOLA (MID-RANGE MODEL)</w:t>
-      </w:r>
-    </w:p>
-    <w:p>
-      <w:pPr>
-        <w:spacing w:before="160" w:after="40"/>
-      </w:pPr>
-      <w:r>
-        <w:rPr>
-          <w:b/>
-          <w:color w:val="888888"/>
-          <w:highlight w:val="yellow"/>
-        </w:rPr>
-        <w:t xml:space="preserve">H2 </w:t>
-      </w:r>
-      <w:r>
-        <w:rPr>
-          <w:b/>
-          <w:highlight w:val="yellow"/>
-        </w:rPr>
-        <w:t>DELTA OPEN SKY MOTORISED ALUMINIUM LOUVRED PERGOLA (MID-RANGE MODEL)</w:t>
-      </w:r>
-    </w:p>
-    <w:p>
-      <w:pPr>
-        <w:spacing w:before="160" w:after="40"/>
-      </w:pPr>
-      <w:r>
-        <w:rPr>
-          <w:b/>
-          <w:color w:val="888888"/>
-          <w:highlight w:val="yellow"/>
-        </w:rPr>
-        <w:t xml:space="preserve">H2 </w:t>
-      </w:r>
-      <w:r>
-        <w:rPr>
-          <w:b/>
-          <w:highlight w:val="yellow"/>
-        </w:rPr>
-        <w:t>DELTA PRO RETRACTABLE ROOF</w:t>
-      </w:r>
-    </w:p>
-    <w:p>
-      <w:pPr>
-        <w:spacing w:before="160" w:after="40"/>
-      </w:pPr>
-      <w:r>
-        <w:rPr>
-          <w:b/>
-          <w:color w:val="888888"/>
-          <w:highlight w:val="yellow"/>
-        </w:rPr>
-        <w:t xml:space="preserve">H2 </w:t>
-      </w:r>
-      <w:r>
-        <w:rPr>
-          <w:b/>
-          <w:highlight w:val="yellow"/>
-        </w:rPr>
-        <w:t>DELTA LIGHT MOTORISED (BASE MODEL)</w:t>
-      </w:r>
-    </w:p>
-    <w:p>
-      <w:pPr>
-        <w:spacing w:before="160" w:after="40"/>
-      </w:pPr>
-      <w:r>
-        <w:rPr>
-          <w:b/>
-          <w:color w:val="888888"/>
-          <w:highlight w:val="yellow"/>
-        </w:rPr>
-        <w:t xml:space="preserve">H2 </w:t>
-      </w:r>
-      <w:r>
-        <w:rPr>
-          <w:b/>
-          <w:highlight w:val="yellow"/>
-        </w:rPr>
-        <w:t>DELTA MOTORISED ALUMINIUM LOUVRED PERGOLA (MID-RANGE MODEL)</w:t>
-      </w:r>
-    </w:p>
-    <w:p>
-      <w:pPr>
-        <w:spacing w:before="160" w:after="40"/>
-      </w:pPr>
-      <w:r>
-        <w:rPr>
-          <w:b/>
-          <w:color w:val="888888"/>
-          <w:highlight w:val="yellow"/>
-        </w:rPr>
-        <w:t xml:space="preserve">H2 </w:t>
-      </w:r>
-      <w:r>
-        <w:rPr>
-          <w:b/>
-          <w:highlight w:val="yellow"/>
-        </w:rPr>
-        <w:t>DELTA OPEN SKY MOTORISED ALUMINIUM LOUVRED PERGOLA (MID-RANGE MODEL)</w:t>
-      </w:r>
-    </w:p>
-    <w:p>
-      <w:pPr>
-        <w:spacing w:before="160" w:after="40"/>
-      </w:pPr>
-      <w:r>
-        <w:rPr>
-          <w:b/>
-          <w:color w:val="888888"/>
-          <w:highlight w:val="yellow"/>
-        </w:rPr>
-        <w:t xml:space="preserve">H2 </w:t>
-      </w:r>
-      <w:r>
-        <w:rPr>
-          <w:b/>
-          <w:highlight w:val="yellow"/>
-        </w:rPr>
-        <w:t>DELTA PRO RETRACTABLE ROOF</w:t>
-      </w:r>
-    </w:p>
-    <w:p>
-      <w:pPr>
-        <w:spacing w:before="160" w:after="40"/>
-      </w:pPr>
-      <w:r>
-        <w:rPr>
-          <w:b/>
-          <w:color w:val="888888"/>
-          <w:highlight w:val="yellow"/>
-        </w:rPr>
-        <w:t xml:space="preserve">H2 </w:t>
-      </w:r>
-      <w:r>
-        <w:rPr>
-          <w:b/>
-          <w:highlight w:val="yellow"/>
-        </w:rPr>
-        <w:t>SKYFLEX 4K Android Smart Outdoor Tv</w:t>
-      </w:r>
-    </w:p>
-    <w:p>
-      <w:pPr>
-        <w:spacing w:before="160" w:after="40"/>
-      </w:pPr>
-      <w:r>
-        <w:rPr>
-          <w:b/>
-          <w:color w:val="888888"/>
-          <w:highlight w:val="yellow"/>
-        </w:rPr>
-        <w:t xml:space="preserve">H2 </w:t>
-      </w:r>
-      <w:r>
-        <w:rPr>
-          <w:b/>
-          <w:highlight w:val="yellow"/>
-        </w:rPr>
-        <w:t>SKYFLEX BBQ Pods</w:t>
-      </w:r>
-    </w:p>
-    <w:p>
-      <w:pPr>
-        <w:spacing w:before="160" w:after="40"/>
-      </w:pPr>
-      <w:r>
-        <w:rPr>
-          <w:b/>
-          <w:color w:val="888888"/>
-          <w:highlight w:val="yellow"/>
-        </w:rPr>
-        <w:t xml:space="preserve">H2 </w:t>
-      </w:r>
-      <w:r>
-        <w:rPr>
-          <w:b/>
-          <w:highlight w:val="yellow"/>
-        </w:rPr>
-        <w:t>Delta Commercial Folding Arm</w:t>
-      </w:r>
-    </w:p>
-    <w:p>
-      <w:pPr>
-        <w:spacing w:before="160" w:after="40"/>
-      </w:pPr>
-      <w:r>
-        <w:rPr>
-          <w:b/>
-          <w:color w:val="888888"/>
-          <w:highlight w:val="yellow"/>
-        </w:rPr>
-        <w:t xml:space="preserve">H2 </w:t>
-      </w:r>
-      <w:r>
-        <w:rPr>
-          <w:b/>
-          <w:highlight w:val="yellow"/>
-        </w:rPr>
-        <w:t>Delta Elevating Pool &amp; Spa Cover</w:t>
-      </w:r>
-    </w:p>
-    <w:p>
-      <w:pPr>
-        <w:spacing w:before="160" w:after="40"/>
-      </w:pPr>
-      <w:r>
-        <w:rPr>
-          <w:b/>
-          <w:color w:val="888888"/>
-          <w:highlight w:val="yellow"/>
-        </w:rPr>
-        <w:t xml:space="preserve">H2 </w:t>
-      </w:r>
-      <w:r>
-        <w:rPr>
-          <w:b/>
-          <w:highlight w:val="yellow"/>
-        </w:rPr>
-        <w:t>Delta Roller Pool &amp; Spa Cover</w:t>
-      </w:r>
-    </w:p>
-    <w:p>
-      <w:pPr>
-        <w:spacing w:before="160" w:after="40"/>
-      </w:pPr>
-      <w:r>
-        <w:rPr>
-          <w:b/>
-          <w:color w:val="888888"/>
-          <w:highlight w:val="yellow"/>
-        </w:rPr>
-        <w:t xml:space="preserve">H2 </w:t>
-      </w:r>
-      <w:r>
-        <w:rPr>
-          <w:b/>
-          <w:highlight w:val="yellow"/>
-        </w:rPr>
-        <w:t>SKYFLEX 4K Android Smart Outdoor Tv</w:t>
-      </w:r>
-    </w:p>
-    <w:p>
-      <w:pPr>
-        <w:spacing w:before="160" w:after="40"/>
-      </w:pPr>
-      <w:r>
-        <w:rPr>
-          <w:b/>
-          <w:color w:val="888888"/>
-          <w:highlight w:val="yellow"/>
-        </w:rPr>
-        <w:t xml:space="preserve">H2 </w:t>
-      </w:r>
-      <w:r>
-        <w:rPr>
-          <w:b/>
-          <w:highlight w:val="yellow"/>
-        </w:rPr>
-        <w:t>SKYFLEX BBQ Pods</w:t>
-      </w:r>
-    </w:p>
-    <w:p>
-      <w:pPr>
-        <w:spacing w:before="160" w:after="40"/>
-      </w:pPr>
-      <w:r>
-        <w:rPr>
-          <w:b/>
-          <w:color w:val="888888"/>
-          <w:highlight w:val="yellow"/>
-        </w:rPr>
-        <w:t xml:space="preserve">H2 </w:t>
-      </w:r>
-      <w:r>
-        <w:rPr>
-          <w:b/>
-          <w:highlight w:val="yellow"/>
-        </w:rPr>
-        <w:t>Delta Commercial Folding Arm</w:t>
-      </w:r>
-    </w:p>
-    <w:p>
-      <w:pPr>
-        <w:spacing w:before="160" w:after="40"/>
-      </w:pPr>
-      <w:r>
-        <w:rPr>
-          <w:b/>
-          <w:color w:val="888888"/>
-          <w:highlight w:val="yellow"/>
-        </w:rPr>
-        <w:t xml:space="preserve">H2 </w:t>
-      </w:r>
-      <w:r>
-        <w:rPr>
-          <w:b/>
-          <w:highlight w:val="yellow"/>
-        </w:rPr>
-        <w:t>Delta Elevating Pool &amp; Spa Cover</w:t>
-      </w:r>
-    </w:p>
-    <w:p>
-      <w:pPr>
-        <w:spacing w:before="160" w:after="40"/>
-      </w:pPr>
-      <w:r>
-        <w:rPr>
-          <w:b/>
-          <w:color w:val="888888"/>
-          <w:highlight w:val="yellow"/>
-        </w:rPr>
-        <w:t xml:space="preserve">H2 </w:t>
-      </w:r>
-      <w:r>
-        <w:rPr>
-          <w:b/>
-          <w:highlight w:val="yellow"/>
-        </w:rPr>
-        <w:t>Delta Roller Pool &amp; Spa Cover</w:t>
-      </w:r>
-    </w:p>
-    <w:p>
-      <w:pPr>
-        <w:spacing w:before="160" w:after="40"/>
-      </w:pPr>
-      <w:r>
-        <w:rPr>
-          <w:b/>
-          <w:color w:val="888888"/>
-          <w:highlight w:val="yellow"/>
-        </w:rPr>
-        <w:t xml:space="preserve">H2 </w:t>
-      </w:r>
-      <w:r>
-        <w:rPr>
-          <w:b/>
-          <w:highlight w:val="yellow"/>
-        </w:rPr>
-        <w:t>SKYFLEX 4K Android Smart Outdoor Tv</w:t>
-      </w:r>
-    </w:p>
-    <w:p>
-      <w:pPr>
-        <w:spacing w:before="160" w:after="40"/>
-      </w:pPr>
-      <w:r>
-        <w:rPr>
-          <w:b/>
-          <w:color w:val="888888"/>
-          <w:highlight w:val="yellow"/>
-        </w:rPr>
-        <w:t xml:space="preserve">H2 </w:t>
-      </w:r>
-      <w:r>
-        <w:rPr>
-          <w:b/>
-          <w:highlight w:val="yellow"/>
-        </w:rPr>
-        <w:t>SKYFLEX BBQ Pods</w:t>
-      </w:r>
-    </w:p>
-    <w:p>
-      <w:pPr>
-        <w:spacing w:before="160" w:after="40"/>
-      </w:pPr>
-      <w:r>
-        <w:rPr>
-          <w:b/>
-          <w:color w:val="888888"/>
-          <w:highlight w:val="yellow"/>
-        </w:rPr>
-        <w:t xml:space="preserve">H2 </w:t>
-      </w:r>
-      <w:r>
-        <w:rPr>
-          <w:b/>
-          <w:highlight w:val="yellow"/>
-        </w:rPr>
-        <w:t>U6 Smartoilet</w:t>
-      </w:r>
-    </w:p>
-    <w:p>
-      <w:pPr>
-        <w:spacing w:before="160" w:after="40"/>
-      </w:pPr>
-      <w:r>
-        <w:rPr>
-          <w:b/>
-          <w:color w:val="888888"/>
-          <w:highlight w:val="yellow"/>
-        </w:rPr>
-        <w:t xml:space="preserve">H2 </w:t>
-      </w:r>
-      <w:r>
-        <w:rPr>
-          <w:b/>
-          <w:highlight w:val="yellow"/>
-        </w:rPr>
-        <w:t>U7 Smartoilet</w:t>
-      </w:r>
-    </w:p>
-    <w:p>
-      <w:pPr>
-        <w:spacing w:before="160" w:after="40"/>
-      </w:pPr>
-      <w:r>
-        <w:rPr>
-          <w:b/>
-          <w:color w:val="888888"/>
-          <w:highlight w:val="yellow"/>
-        </w:rPr>
-        <w:t xml:space="preserve">H2 </w:t>
-      </w:r>
-      <w:r>
-        <w:rPr>
-          <w:b/>
-          <w:highlight w:val="yellow"/>
-        </w:rPr>
-        <w:t>LOUVRED ROOF PERGOLAS FOR YOUR SYDNEY PROPERTY</w:t>
-      </w:r>
-    </w:p>
-    <w:p>
-      <w:pPr>
-        <w:spacing w:before="160" w:after="40"/>
-      </w:pPr>
-      <w:r>
-        <w:rPr>
-          <w:b/>
-          <w:color w:val="888888"/>
-          <w:highlight w:val="yellow"/>
-        </w:rPr>
-        <w:t xml:space="preserve">H2 </w:t>
-      </w:r>
-      <w:r>
-        <w:rPr>
-          <w:b/>
-          <w:highlight w:val="yellow"/>
-        </w:rPr>
-        <w:t>VERSATILE DESIGN OPTIONS FOR LOUVRED PERGOLAS SYDNEY</w:t>
-      </w:r>
-    </w:p>
-    <w:p>
-      <w:pPr>
-        <w:spacing w:before="160" w:after="40"/>
-      </w:pPr>
-      <w:r>
-        <w:rPr>
-          <w:b/>
-          <w:color w:val="888888"/>
-          <w:highlight w:val="yellow"/>
-        </w:rPr>
-        <w:t xml:space="preserve">H2 </w:t>
-      </w:r>
-      <w:r>
-        <w:rPr>
-          <w:b/>
-          <w:highlight w:val="yellow"/>
-        </w:rPr>
-        <w:t>WHY CHOOSE SKYFLEX FOR LOUVRED PERGOLAS IN SYDNEY</w:t>
-      </w:r>
-    </w:p>
-    <w:p>
-      <w:pPr>
-        <w:spacing w:before="160" w:after="40"/>
-      </w:pPr>
-      <w:r>
-        <w:rPr>
-          <w:b/>
-          <w:color w:val="888888"/>
-          <w:highlight w:val="yellow"/>
-        </w:rPr>
-        <w:t xml:space="preserve">H3 </w:t>
-      </w:r>
-      <w:r>
-        <w:rPr>
-          <w:b/>
-          <w:highlight w:val="yellow"/>
-        </w:rPr>
-        <w:t>TALK TO OUR AUSTRALIAN TEAM</w:t>
-      </w:r>
-    </w:p>
-    <w:p>
-      <w:pPr>
-        <w:spacing w:before="160" w:after="40"/>
-      </w:pPr>
-      <w:r>
-        <w:rPr>
-          <w:b/>
-          <w:color w:val="888888"/>
-          <w:highlight w:val="yellow"/>
-        </w:rPr>
-        <w:t xml:space="preserve">H3 </w:t>
-      </w:r>
-      <w:r>
-        <w:rPr>
-          <w:b/>
-          <w:highlight w:val="yellow"/>
-        </w:rPr>
-        <w:t>SKYFLEX VS. OTHERS</w:t>
-      </w:r>
-    </w:p>
-    <w:p>
-      <w:pPr>
-        <w:spacing w:before="160" w:after="40"/>
-      </w:pPr>
-      <w:r>
-        <w:rPr>
-          <w:b/>
-          <w:color w:val="888888"/>
-          <w:highlight w:val="yellow"/>
-        </w:rPr>
-        <w:t xml:space="preserve">H3 </w:t>
-      </w:r>
-      <w:r>
-        <w:rPr>
-          <w:b/>
-          <w:highlight w:val="yellow"/>
-        </w:rPr>
-        <w:t>UP TO 8X CHEAPER</w:t>
-      </w:r>
-    </w:p>
-    <w:p>
-      <w:pPr>
-        <w:spacing w:before="160" w:after="40"/>
-      </w:pPr>
-      <w:r>
-        <w:rPr>
-          <w:b/>
-          <w:color w:val="888888"/>
-          <w:highlight w:val="yellow"/>
-        </w:rPr>
-        <w:t xml:space="preserve">H3 </w:t>
-      </w:r>
-      <w:r>
-        <w:rPr>
-          <w:b/>
-          <w:highlight w:val="yellow"/>
-        </w:rPr>
-        <w:t>WHAT OUR CLIENTS SAY ABOUT US</w:t>
-      </w:r>
-    </w:p>
-    <w:p>
-      <w:pPr>
-        <w:spacing w:before="160" w:after="40"/>
-      </w:pPr>
-      <w:r>
-        <w:rPr>
-          <w:b/>
-          <w:color w:val="888888"/>
-          <w:highlight w:val="yellow"/>
-        </w:rPr>
-        <w:t xml:space="preserve">H2 </w:t>
-      </w:r>
-      <w:r>
-        <w:rPr>
-          <w:b/>
-          <w:highlight w:val="yellow"/>
-        </w:rPr>
-        <w:t>BUY LOUVRED PERGOLAS IN SYDNEY FROM SKYFLEX</w:t>
-      </w:r>
-    </w:p>
-    <w:p>
-      <w:pPr>
-        <w:spacing w:before="160" w:after="40"/>
-      </w:pPr>
-      <w:r>
-        <w:rPr>
-          <w:b/>
-          <w:color w:val="888888"/>
-          <w:highlight w:val="yellow"/>
-        </w:rPr>
-        <w:t xml:space="preserve">H2 </w:t>
-      </w:r>
-      <w:r>
-        <w:rPr>
-          <w:b/>
-          <w:highlight w:val="yellow"/>
-        </w:rPr>
-        <w:t>FREQUENTLY ASKED QUESTIONS ABOUT LOUVRED PERGOLAS IN SYDNEY</w:t>
-      </w:r>
-    </w:p>
-    <w:p>
-      <w:pPr>
-        <w:spacing w:before="160" w:after="40"/>
-      </w:pPr>
-      <w:r>
-        <w:rPr>
-          <w:b/>
-          <w:color w:val="888888"/>
-          <w:highlight w:val="yellow"/>
-        </w:rPr>
-        <w:t xml:space="preserve">H3 </w:t>
-      </w:r>
-      <w:r>
-        <w:rPr>
-          <w:b/>
-          <w:highlight w:val="yellow"/>
-        </w:rPr>
-        <w:t>TALK TO OUR AUSTRALIAN TEAM</w:t>
-      </w:r>
-    </w:p>
-    <w:p>
-      <w:r>
-        <w:rPr>
-          <w:b/>
-        </w:rPr>
-        <w:t>Sample of existing body copy (kept):</w:t>
-      </w:r>
-    </w:p>
-    <w:p>
-      <w:r>
-        <w:rPr>
-          <w:b w:val="0"/>
-          <w:highlight w:val="yellow"/>
-        </w:rPr>
-        <w:t>Are you interested in louvred pergolas in Sydney? SkyFlex designs and installs these versatile structures for homes and businesses across the city. Our pergolas feature adjustable slats, giving you control over sunlight and airflow in your outdoor space.</w:t>
-      </w:r>
-    </w:p>
-    <w:p>
-      <w:r>
-        <w:rPr>
-          <w:b w:val="0"/>
-          <w:highlight w:val="yellow"/>
-        </w:rPr>
-        <w:t>Our team creates louvred pergolas for patios, gardens, and commercial areas. We build to match your specific needs and style preferences. Get in touch with us today to learn more.</w:t>
-      </w:r>
-    </w:p>
-    <w:p>
-      <w:r>
-        <w:rPr>
-          <w:b w:val="0"/>
-          <w:highlight w:val="yellow"/>
-        </w:rPr>
-        <w:t>Want to make your Sydney backyard something special? louvred roof pergola from SkyFlex might be just what you’re after. We create pergolas that not only look great but work for your lifestyle too.</w:t>
-      </w:r>
-    </w:p>
-    <w:p>
-      <w:r>
-        <w:rPr>
-          <w:b w:val="0"/>
-          <w:highlight w:val="yellow"/>
-        </w:rPr>
-        <w:t>Our louvres let you control the sun and breeze, so you’re comfortable no matter what Sydney’s weather throws at you. Whether you’re dreaming of a quiet reading nook or a showstopper for BBQs, we’ve got you covered.</w:t>
-      </w:r>
-    </w:p>
-    <w:p>
-      <w:r>
-        <w:rPr>
-          <w:b w:val="0"/>
-          <w:highlight w:val="yellow"/>
-        </w:rPr>
-        <w:t>We know Sydney’s weather can be tough, so we build our pergolas to last.</w:t>
-      </w:r>
-    </w:p>
     <w:p>
       <w:r>
         <w:br w:type="page"/>
@@ -2173,7 +740,7 @@
           <w:b/>
           <w:color w:val="888888"/>
         </w:rPr>
-        <w:t xml:space="preserve">H1 </w:t>
+        <w:t xml:space="preserve">H1: </w:t>
       </w:r>
       <w:r>
         <w:rPr>
@@ -2207,7 +774,7 @@
           <w:b/>
           <w:color w:val="888888"/>
         </w:rPr>
-        <w:t xml:space="preserve">H2 </w:t>
+        <w:t xml:space="preserve">H2: </w:t>
       </w:r>
       <w:r>
         <w:rPr>
@@ -2233,7 +800,7 @@
           <w:b/>
           <w:color w:val="888888"/>
         </w:rPr>
-        <w:t xml:space="preserve">H2 </w:t>
+        <w:t xml:space="preserve">H2: </w:t>
       </w:r>
       <w:r>
         <w:rPr>
@@ -2356,7 +923,7 @@
           <w:b/>
           <w:color w:val="888888"/>
         </w:rPr>
-        <w:t xml:space="preserve">H2 </w:t>
+        <w:t xml:space="preserve">H2: </w:t>
       </w:r>
       <w:r>
         <w:rPr>
@@ -2390,7 +957,7 @@
           <w:b/>
           <w:color w:val="888888"/>
         </w:rPr>
-        <w:t xml:space="preserve">H2 </w:t>
+        <w:t xml:space="preserve">H2: </w:t>
       </w:r>
       <w:r>
         <w:rPr>
@@ -2446,7 +1013,7 @@
           <w:b/>
           <w:color w:val="888888"/>
         </w:rPr>
-        <w:t xml:space="preserve">H2 </w:t>
+        <w:t xml:space="preserve">H2: </w:t>
       </w:r>
       <w:r>
         <w:rPr>
@@ -2464,7 +1031,7 @@
           <w:b/>
           <w:color w:val="888888"/>
         </w:rPr>
-        <w:t xml:space="preserve">H3 </w:t>
+        <w:t xml:space="preserve">H3: </w:t>
       </w:r>
       <w:r>
         <w:rPr>
@@ -2490,7 +1057,7 @@
           <w:b/>
           <w:color w:val="888888"/>
         </w:rPr>
-        <w:t xml:space="preserve">H3 </w:t>
+        <w:t xml:space="preserve">H3: </w:t>
       </w:r>
       <w:r>
         <w:rPr>
@@ -2516,7 +1083,7 @@
           <w:b/>
           <w:color w:val="888888"/>
         </w:rPr>
-        <w:t xml:space="preserve">H3 </w:t>
+        <w:t xml:space="preserve">H3: </w:t>
       </w:r>
       <w:r>
         <w:rPr>
@@ -2542,7 +1109,7 @@
           <w:b/>
           <w:color w:val="888888"/>
         </w:rPr>
-        <w:t xml:space="preserve">H2 </w:t>
+        <w:t xml:space="preserve">H2: </w:t>
       </w:r>
       <w:r>
         <w:rPr>
@@ -2642,7 +1209,7 @@
           <w:b/>
           <w:color w:val="888888"/>
         </w:rPr>
-        <w:t xml:space="preserve">H1 </w:t>
+        <w:t xml:space="preserve">H1: </w:t>
       </w:r>
       <w:r>
         <w:rPr>
@@ -2668,7 +1235,7 @@
           <w:b/>
           <w:color w:val="888888"/>
         </w:rPr>
-        <w:t xml:space="preserve">H2 </w:t>
+        <w:t xml:space="preserve">H2: </w:t>
       </w:r>
       <w:r>
         <w:rPr>
@@ -2717,7 +1284,7 @@
           <w:b/>
           <w:color w:val="888888"/>
         </w:rPr>
-        <w:t xml:space="preserve">H2 </w:t>
+        <w:t xml:space="preserve">H2: </w:t>
       </w:r>
       <w:r>
         <w:rPr>
@@ -2850,7 +1417,7 @@
           <w:b/>
           <w:color w:val="888888"/>
         </w:rPr>
-        <w:t xml:space="preserve">H2 </w:t>
+        <w:t xml:space="preserve">H2: </w:t>
       </w:r>
       <w:r>
         <w:rPr>
@@ -2884,7 +1451,7 @@
           <w:b/>
           <w:color w:val="888888"/>
         </w:rPr>
-        <w:t xml:space="preserve">H2 </w:t>
+        <w:t xml:space="preserve">H2: </w:t>
       </w:r>
       <w:r>
         <w:rPr>
@@ -2925,7 +1492,7 @@
           <w:b/>
           <w:color w:val="888888"/>
         </w:rPr>
-        <w:t xml:space="preserve">H2 </w:t>
+        <w:t xml:space="preserve">H2: </w:t>
       </w:r>
       <w:r>
         <w:rPr>
@@ -3025,7 +1592,7 @@
           <w:b/>
           <w:color w:val="888888"/>
         </w:rPr>
-        <w:t xml:space="preserve">H1 </w:t>
+        <w:t xml:space="preserve">H1: </w:t>
       </w:r>
       <w:r>
         <w:rPr>
@@ -3051,7 +1618,7 @@
           <w:b/>
           <w:color w:val="888888"/>
         </w:rPr>
-        <w:t xml:space="preserve">H2 </w:t>
+        <w:t xml:space="preserve">H2: </w:t>
       </w:r>
       <w:r>
         <w:rPr>
@@ -3085,7 +1652,7 @@
           <w:b/>
           <w:color w:val="888888"/>
         </w:rPr>
-        <w:t xml:space="preserve">H2 </w:t>
+        <w:t xml:space="preserve">H2: </w:t>
       </w:r>
       <w:r>
         <w:rPr>
@@ -3119,7 +1686,7 @@
           <w:b/>
           <w:color w:val="888888"/>
         </w:rPr>
-        <w:t xml:space="preserve">H2 </w:t>
+        <w:t xml:space="preserve">H2: </w:t>
       </w:r>
       <w:r>
         <w:rPr>
@@ -3299,7 +1866,7 @@
           <w:b/>
           <w:color w:val="888888"/>
         </w:rPr>
-        <w:t xml:space="preserve">H2 </w:t>
+        <w:t xml:space="preserve">H2: </w:t>
       </w:r>
       <w:r>
         <w:rPr>
@@ -3333,7 +1900,7 @@
           <w:b/>
           <w:color w:val="888888"/>
         </w:rPr>
-        <w:t xml:space="preserve">H2 </w:t>
+        <w:t xml:space="preserve">H2: </w:t>
       </w:r>
       <w:r>
         <w:rPr>
@@ -3389,7 +1956,7 @@
           <w:b/>
           <w:color w:val="888888"/>
         </w:rPr>
-        <w:t xml:space="preserve">H2 </w:t>
+        <w:t xml:space="preserve">H2: </w:t>
       </w:r>
       <w:r>
         <w:rPr>
@@ -3407,7 +1974,7 @@
           <w:b/>
           <w:color w:val="888888"/>
         </w:rPr>
-        <w:t xml:space="preserve">H3 </w:t>
+        <w:t xml:space="preserve">H3: </w:t>
       </w:r>
       <w:r>
         <w:rPr>
@@ -3433,7 +2000,7 @@
           <w:b/>
           <w:color w:val="888888"/>
         </w:rPr>
-        <w:t xml:space="preserve">H3 </w:t>
+        <w:t xml:space="preserve">H3: </w:t>
       </w:r>
       <w:r>
         <w:rPr>
@@ -3459,7 +2026,7 @@
           <w:b/>
           <w:color w:val="888888"/>
         </w:rPr>
-        <w:t xml:space="preserve">H3 </w:t>
+        <w:t xml:space="preserve">H3: </w:t>
       </w:r>
       <w:r>
         <w:rPr>
@@ -3485,7 +2052,7 @@
           <w:b/>
           <w:color w:val="888888"/>
         </w:rPr>
-        <w:t xml:space="preserve">H3 </w:t>
+        <w:t xml:space="preserve">H3: </w:t>
       </w:r>
       <w:r>
         <w:rPr>
@@ -3511,7 +2078,7 @@
           <w:b/>
           <w:color w:val="888888"/>
         </w:rPr>
-        <w:t xml:space="preserve">H2 </w:t>
+        <w:t xml:space="preserve">H2: </w:t>
       </w:r>
       <w:r>
         <w:rPr>
@@ -3611,7 +2178,7 @@
           <w:b/>
           <w:color w:val="888888"/>
         </w:rPr>
-        <w:t xml:space="preserve">H1 </w:t>
+        <w:t xml:space="preserve">H1: </w:t>
       </w:r>
       <w:r>
         <w:rPr>
@@ -3637,7 +2204,7 @@
           <w:b/>
           <w:color w:val="888888"/>
         </w:rPr>
-        <w:t xml:space="preserve">H2 </w:t>
+        <w:t xml:space="preserve">H2: </w:t>
       </w:r>
       <w:r>
         <w:rPr>
@@ -3663,7 +2230,7 @@
           <w:b/>
           <w:color w:val="888888"/>
         </w:rPr>
-        <w:t xml:space="preserve">H2 </w:t>
+        <w:t xml:space="preserve">H2: </w:t>
       </w:r>
       <w:r>
         <w:rPr>
@@ -3736,7 +2303,7 @@
           <w:b/>
           <w:color w:val="888888"/>
         </w:rPr>
-        <w:t xml:space="preserve">H2 </w:t>
+        <w:t xml:space="preserve">H2: </w:t>
       </w:r>
       <w:r>
         <w:rPr>
@@ -3770,7 +2337,7 @@
           <w:b/>
           <w:color w:val="888888"/>
         </w:rPr>
-        <w:t xml:space="preserve">H2 </w:t>
+        <w:t xml:space="preserve">H2: </w:t>
       </w:r>
       <w:r>
         <w:rPr>
@@ -3811,7 +2378,7 @@
           <w:b/>
           <w:color w:val="888888"/>
         </w:rPr>
-        <w:t xml:space="preserve">H2 </w:t>
+        <w:t xml:space="preserve">H2: </w:t>
       </w:r>
       <w:r>
         <w:rPr>
@@ -3903,7 +2470,7 @@
           <w:b/>
           <w:color w:val="888888"/>
         </w:rPr>
-        <w:t xml:space="preserve">H1 </w:t>
+        <w:t xml:space="preserve">H1: </w:t>
       </w:r>
       <w:r>
         <w:rPr>
@@ -3974,7 +2541,7 @@
           <w:b/>
           <w:color w:val="888888"/>
         </w:rPr>
-        <w:t xml:space="preserve">H2 </w:t>
+        <w:t xml:space="preserve">H2: </w:t>
       </w:r>
       <w:r>
         <w:rPr>
@@ -4008,7 +2575,7 @@
           <w:b/>
           <w:color w:val="888888"/>
         </w:rPr>
-        <w:t xml:space="preserve">H2 </w:t>
+        <w:t xml:space="preserve">H2: </w:t>
       </w:r>
       <w:r>
         <w:rPr>
@@ -4097,7 +2664,7 @@
           <w:b/>
           <w:color w:val="888888"/>
         </w:rPr>
-        <w:t xml:space="preserve">H2 </w:t>
+        <w:t xml:space="preserve">H2: </w:t>
       </w:r>
       <w:r>
         <w:rPr>
@@ -4131,7 +2698,7 @@
           <w:b/>
           <w:color w:val="888888"/>
         </w:rPr>
-        <w:t xml:space="preserve">H2 </w:t>
+        <w:t xml:space="preserve">H2: </w:t>
       </w:r>
       <w:r>
         <w:rPr>
@@ -4182,7 +2749,7 @@
           <w:b/>
           <w:color w:val="888888"/>
         </w:rPr>
-        <w:t xml:space="preserve">H2 </w:t>
+        <w:t xml:space="preserve">H2: </w:t>
       </w:r>
       <w:r>
         <w:rPr>
@@ -4208,7 +2775,7 @@
           <w:b/>
           <w:color w:val="888888"/>
         </w:rPr>
-        <w:t xml:space="preserve">H2 </w:t>
+        <w:t xml:space="preserve">H2: </w:t>
       </w:r>
       <w:r>
         <w:rPr>
@@ -4226,7 +2793,7 @@
           <w:b/>
           <w:color w:val="888888"/>
         </w:rPr>
-        <w:t xml:space="preserve">H3 </w:t>
+        <w:t xml:space="preserve">H3: </w:t>
       </w:r>
       <w:r>
         <w:rPr>
@@ -4252,7 +2819,7 @@
           <w:b/>
           <w:color w:val="888888"/>
         </w:rPr>
-        <w:t xml:space="preserve">H3 </w:t>
+        <w:t xml:space="preserve">H3: </w:t>
       </w:r>
       <w:r>
         <w:rPr>
@@ -4278,7 +2845,7 @@
           <w:b/>
           <w:color w:val="888888"/>
         </w:rPr>
-        <w:t xml:space="preserve">H3 </w:t>
+        <w:t xml:space="preserve">H3: </w:t>
       </w:r>
       <w:r>
         <w:rPr>
@@ -4304,7 +2871,7 @@
           <w:b/>
           <w:color w:val="888888"/>
         </w:rPr>
-        <w:t xml:space="preserve">H3 </w:t>
+        <w:t xml:space="preserve">H3: </w:t>
       </w:r>
       <w:r>
         <w:rPr>
@@ -4330,7 +2897,7 @@
           <w:b/>
           <w:color w:val="888888"/>
         </w:rPr>
-        <w:t xml:space="preserve">H3 </w:t>
+        <w:t xml:space="preserve">H3: </w:t>
       </w:r>
       <w:r>
         <w:rPr>
@@ -4356,7 +2923,7 @@
           <w:b/>
           <w:color w:val="888888"/>
         </w:rPr>
-        <w:t xml:space="preserve">H3 </w:t>
+        <w:t xml:space="preserve">H3: </w:t>
       </w:r>
       <w:r>
         <w:rPr>
@@ -4382,7 +2949,7 @@
           <w:b/>
           <w:color w:val="888888"/>
         </w:rPr>
-        <w:t xml:space="preserve">H3 </w:t>
+        <w:t xml:space="preserve">H3: </w:t>
       </w:r>
       <w:r>
         <w:rPr>
@@ -4408,7 +2975,7 @@
           <w:b/>
           <w:color w:val="888888"/>
         </w:rPr>
-        <w:t xml:space="preserve">H2 </w:t>
+        <w:t xml:space="preserve">H2: </w:t>
       </w:r>
       <w:r>
         <w:rPr>

</xml_diff>

<commit_message>
skyflex.au — expand FAQs to 8 per page (grounded in forms customer questions + on-page specs, em-dash-free); add intro H2 on 4 product pages so content block sits under H2 (H1 replaces existing product title, content added lower); all re-audited 0 blocking, humanity/diff 100, coherence clean; re-approved; docx+HTML rebuilt
</commit_message>
<xml_diff>
--- a/clients/skyflex.au/content/exports/delivery-2026-07-16T05-22/skyflex-content-deliverable.docx
+++ b/clients/skyflex.au/content/exports/delivery-2026-07-16T05-22/skyflex-content-deliverable.docx
@@ -400,6 +400,232 @@
       </w:r>
     </w:p>
     <w:p>
+      <w:pPr>
+        <w:spacing w:before="160" w:after="40"/>
+      </w:pPr>
+      <w:r>
+        <w:rPr>
+          <w:b/>
+          <w:color w:val="888888"/>
+        </w:rPr>
+        <w:t xml:space="preserve">H2: </w:t>
+      </w:r>
+      <w:r>
+        <w:rPr>
+          <w:b/>
+        </w:rPr>
+        <w:t>Louvred pergola questions Melbourne buyers ask</w:t>
+      </w:r>
+    </w:p>
+    <w:p>
+      <w:pPr>
+        <w:spacing w:before="160" w:after="40"/>
+      </w:pPr>
+      <w:r>
+        <w:rPr>
+          <w:b/>
+          <w:color w:val="888888"/>
+        </w:rPr>
+        <w:t xml:space="preserve">H3: </w:t>
+      </w:r>
+      <w:r>
+        <w:rPr>
+          <w:b/>
+        </w:rPr>
+        <w:t>How do louvred pergolas handle Melbourne's weather?</w:t>
+      </w:r>
+    </w:p>
+    <w:p>
+      <w:r>
+        <w:rPr>
+          <w:b w:val="0"/>
+        </w:rPr>
+        <w:t>The adjustable aluminium slats tilt open to let sun and air through, or close flat to shed rain, so you control the space through heat, wind and a sudden downpour. The aluminium frame with stainless steel hardware is built to sit outside through every season.</w:t>
+      </w:r>
+    </w:p>
+    <w:p>
+      <w:pPr>
+        <w:spacing w:before="160" w:after="40"/>
+      </w:pPr>
+      <w:r>
+        <w:rPr>
+          <w:b/>
+          <w:color w:val="888888"/>
+        </w:rPr>
+        <w:t xml:space="preserve">H3: </w:t>
+      </w:r>
+      <w:r>
+        <w:rPr>
+          <w:b/>
+        </w:rPr>
+        <w:t>Do I need council approval for a pergola in Melbourne?</w:t>
+      </w:r>
+    </w:p>
+    <w:p>
+      <w:r>
+        <w:rPr>
+          <w:b w:val="0"/>
+        </w:rPr>
+        <w:t>It depends on your property and where the structure sits, and the rules differ between councils. Check with your local council before you order, and we can supply the specifications and dimensions they may ask to see.</w:t>
+      </w:r>
+    </w:p>
+    <w:p>
+      <w:pPr>
+        <w:spacing w:before="160" w:after="40"/>
+      </w:pPr>
+      <w:r>
+        <w:rPr>
+          <w:b/>
+          <w:color w:val="888888"/>
+        </w:rPr>
+        <w:t xml:space="preserve">H3: </w:t>
+      </w:r>
+      <w:r>
+        <w:rPr>
+          <w:b/>
+        </w:rPr>
+        <w:t>Can I install a louvred pergola myself?</w:t>
+      </w:r>
+    </w:p>
+    <w:p>
+      <w:r>
+        <w:rPr>
+          <w:b w:val="0"/>
+        </w:rPr>
+        <w:t>Yes. Every pergola is sold as a DIY kit with instructions, or you can have one of our approved installers fit it at an affordable rate. The product is the same either way, only the labour changes.</w:t>
+      </w:r>
+    </w:p>
+    <w:p>
+      <w:pPr>
+        <w:spacing w:before="160" w:after="40"/>
+      </w:pPr>
+      <w:r>
+        <w:rPr>
+          <w:b/>
+          <w:color w:val="888888"/>
+        </w:rPr>
+        <w:t xml:space="preserve">H3: </w:t>
+      </w:r>
+      <w:r>
+        <w:rPr>
+          <w:b/>
+        </w:rPr>
+        <w:t>What warranty comes with a Skyflex pergola?</w:t>
+      </w:r>
+    </w:p>
+    <w:p>
+      <w:r>
+        <w:rPr>
+          <w:b w:val="0"/>
+        </w:rPr>
+        <w:t>Up to a 15-year product warranty, well beyond the 1 to 5 years common across the market.</w:t>
+      </w:r>
+    </w:p>
+    <w:p>
+      <w:pPr>
+        <w:spacing w:before="160" w:after="40"/>
+      </w:pPr>
+      <w:r>
+        <w:rPr>
+          <w:b/>
+          <w:color w:val="888888"/>
+        </w:rPr>
+        <w:t xml:space="preserve">H3: </w:t>
+      </w:r>
+      <w:r>
+        <w:rPr>
+          <w:b/>
+        </w:rPr>
+        <w:t>How much maintenance does a louvred pergola need?</w:t>
+      </w:r>
+    </w:p>
+    <w:p>
+      <w:r>
+        <w:rPr>
+          <w:b w:val="0"/>
+        </w:rPr>
+        <w:t>Very little. Because the structure is aluminium rather than timber, it does not rot or rust, so it needs no regular servicing beyond an occasional clean.</w:t>
+      </w:r>
+    </w:p>
+    <w:p>
+      <w:pPr>
+        <w:spacing w:before="160" w:after="40"/>
+      </w:pPr>
+      <w:r>
+        <w:rPr>
+          <w:b/>
+          <w:color w:val="888888"/>
+        </w:rPr>
+        <w:t xml:space="preserve">H3: </w:t>
+      </w:r>
+      <w:r>
+        <w:rPr>
+          <w:b/>
+        </w:rPr>
+        <w:t>What sizes and colours can I choose?</w:t>
+      </w:r>
+    </w:p>
+    <w:p>
+      <w:r>
+        <w:rPr>
+          <w:b w:val="0"/>
+        </w:rPr>
+        <w:t>The pergolas are fully customisable to the size, setting and colour of your space, from earthy tones through to black or white.</w:t>
+      </w:r>
+    </w:p>
+    <w:p>
+      <w:pPr>
+        <w:spacing w:before="160" w:after="40"/>
+      </w:pPr>
+      <w:r>
+        <w:rPr>
+          <w:b/>
+          <w:color w:val="888888"/>
+        </w:rPr>
+        <w:t xml:space="preserve">H3: </w:t>
+      </w:r>
+      <w:r>
+        <w:rPr>
+          <w:b/>
+        </w:rPr>
+        <w:t>What is the difference between the Delta models?</w:t>
+      </w:r>
+    </w:p>
+    <w:p>
+      <w:r>
+        <w:rPr>
+          <w:b w:val="0"/>
+        </w:rPr>
+        <w:t>The Delta Light Motorised is the entry model. The Delta Motorised and Delta Open Sky sit in the mid-range, and the Open Sky is the one whose blades both rotate and fully retract, opening the roof right back to the sky.</w:t>
+      </w:r>
+    </w:p>
+    <w:p>
+      <w:pPr>
+        <w:spacing w:before="160" w:after="40"/>
+      </w:pPr>
+      <w:r>
+        <w:rPr>
+          <w:b/>
+          <w:color w:val="888888"/>
+        </w:rPr>
+        <w:t xml:space="preserve">H3: </w:t>
+      </w:r>
+      <w:r>
+        <w:rPr>
+          <w:b/>
+        </w:rPr>
+        <w:t>How do I order, and can I see one first?</w:t>
+      </w:r>
+    </w:p>
+    <w:p>
+      <w:r>
+        <w:rPr>
+          <w:b w:val="0"/>
+        </w:rPr>
+        <w:t>Order online, or request a quote for a custom project and the team will match it to the right model and finish. You are also welcome to visit the Epping showroom by appointment to see the range before you buy.</w:t>
+      </w:r>
+    </w:p>
+    <w:p>
       <w:r>
         <w:br w:type="page"/>
       </w:r>
@@ -658,6 +884,232 @@
       </w:r>
     </w:p>
     <w:p>
+      <w:pPr>
+        <w:spacing w:before="160" w:after="40"/>
+      </w:pPr>
+      <w:r>
+        <w:rPr>
+          <w:b/>
+          <w:color w:val="888888"/>
+        </w:rPr>
+        <w:t xml:space="preserve">H2: </w:t>
+      </w:r>
+      <w:r>
+        <w:rPr>
+          <w:b/>
+        </w:rPr>
+        <w:t>Pergola questions from Sydney buyers</w:t>
+      </w:r>
+    </w:p>
+    <w:p>
+      <w:pPr>
+        <w:spacing w:before="160" w:after="40"/>
+      </w:pPr>
+      <w:r>
+        <w:rPr>
+          <w:b/>
+          <w:color w:val="888888"/>
+        </w:rPr>
+        <w:t xml:space="preserve">H3: </w:t>
+      </w:r>
+      <w:r>
+        <w:rPr>
+          <w:b/>
+        </w:rPr>
+        <w:t>How does ordering a pergola work if I am in Sydney?</w:t>
+      </w:r>
+    </w:p>
+    <w:p>
+      <w:r>
+        <w:rPr>
+          <w:b w:val="0"/>
+        </w:rPr>
+        <w:t>Skyflex is based in Melbourne and ships nationwide. You order the louvred pergola as a kit, we make and deliver it to your Sydney address, and you either assemble it with the instructions or have one of our approved installers fit it.</w:t>
+      </w:r>
+    </w:p>
+    <w:p>
+      <w:pPr>
+        <w:spacing w:before="160" w:after="40"/>
+      </w:pPr>
+      <w:r>
+        <w:rPr>
+          <w:b/>
+          <w:color w:val="888888"/>
+        </w:rPr>
+        <w:t xml:space="preserve">H3: </w:t>
+      </w:r>
+      <w:r>
+        <w:rPr>
+          <w:b/>
+        </w:rPr>
+        <w:t>Is there a Skyflex installer in Sydney?</w:t>
+      </w:r>
+    </w:p>
+    <w:p>
+      <w:r>
+        <w:rPr>
+          <w:b w:val="0"/>
+        </w:rPr>
+        <w:t>Fitting in Sydney is handled through our approved-installer network, or by you with the supplied kit. There is no in-house Skyflex crew in Sydney, which is part of what keeps the finished pergola well under a custom-built one.</w:t>
+      </w:r>
+    </w:p>
+    <w:p>
+      <w:pPr>
+        <w:spacing w:before="160" w:after="40"/>
+      </w:pPr>
+      <w:r>
+        <w:rPr>
+          <w:b/>
+          <w:color w:val="888888"/>
+        </w:rPr>
+        <w:t xml:space="preserve">H3: </w:t>
+      </w:r>
+      <w:r>
+        <w:rPr>
+          <w:b/>
+        </w:rPr>
+        <w:t>How do louvred pergolas handle the weather?</w:t>
+      </w:r>
+    </w:p>
+    <w:p>
+      <w:r>
+        <w:rPr>
+          <w:b w:val="0"/>
+        </w:rPr>
+        <w:t>The adjustable aluminium slats open for sun and air or close flat against rain. The aluminium frame with stainless steel hardware and double-walled, gasket-sealed louvre blades is built to stay outside through every season.</w:t>
+      </w:r>
+    </w:p>
+    <w:p>
+      <w:pPr>
+        <w:spacing w:before="160" w:after="40"/>
+      </w:pPr>
+      <w:r>
+        <w:rPr>
+          <w:b/>
+          <w:color w:val="888888"/>
+        </w:rPr>
+        <w:t xml:space="preserve">H3: </w:t>
+      </w:r>
+      <w:r>
+        <w:rPr>
+          <w:b/>
+        </w:rPr>
+        <w:t>Do I need council approval in Sydney?</w:t>
+      </w:r>
+    </w:p>
+    <w:p>
+      <w:r>
+        <w:rPr>
+          <w:b w:val="0"/>
+        </w:rPr>
+        <w:t>It depends on the property and where the structure sits, and requirements vary by area. Check with your local council before you order, and we can supply the specifications and dimensions they may ask to see.</w:t>
+      </w:r>
+    </w:p>
+    <w:p>
+      <w:pPr>
+        <w:spacing w:before="160" w:after="40"/>
+      </w:pPr>
+      <w:r>
+        <w:rPr>
+          <w:b/>
+          <w:color w:val="888888"/>
+        </w:rPr>
+        <w:t xml:space="preserve">H3: </w:t>
+      </w:r>
+      <w:r>
+        <w:rPr>
+          <w:b/>
+        </w:rPr>
+        <w:t>What warranty do I get?</w:t>
+      </w:r>
+    </w:p>
+    <w:p>
+      <w:r>
+        <w:rPr>
+          <w:b w:val="0"/>
+        </w:rPr>
+        <w:t>Up to a 15-year product warranty, well beyond the 1 to 5 years common across the market.</w:t>
+      </w:r>
+    </w:p>
+    <w:p>
+      <w:pPr>
+        <w:spacing w:before="160" w:after="40"/>
+      </w:pPr>
+      <w:r>
+        <w:rPr>
+          <w:b/>
+          <w:color w:val="888888"/>
+        </w:rPr>
+        <w:t xml:space="preserve">H3: </w:t>
+      </w:r>
+      <w:r>
+        <w:rPr>
+          <w:b/>
+        </w:rPr>
+        <w:t>How much maintenance is involved?</w:t>
+      </w:r>
+    </w:p>
+    <w:p>
+      <w:r>
+        <w:rPr>
+          <w:b w:val="0"/>
+        </w:rPr>
+        <w:t>Little to none. The aluminium structure does not rot or rust, so it needs no regular servicing beyond an occasional clean.</w:t>
+      </w:r>
+    </w:p>
+    <w:p>
+      <w:pPr>
+        <w:spacing w:before="160" w:after="40"/>
+      </w:pPr>
+      <w:r>
+        <w:rPr>
+          <w:b/>
+          <w:color w:val="888888"/>
+        </w:rPr>
+        <w:t xml:space="preserve">H3: </w:t>
+      </w:r>
+      <w:r>
+        <w:rPr>
+          <w:b/>
+        </w:rPr>
+        <w:t>Can I choose the size, colour and configuration?</w:t>
+      </w:r>
+    </w:p>
+    <w:p>
+      <w:r>
+        <w:rPr>
+          <w:b w:val="0"/>
+        </w:rPr>
+        <w:t>Yes. The pergolas are fully customisable to the size, setting and colour of your space, from earthy tones through to black or white.</w:t>
+      </w:r>
+    </w:p>
+    <w:p>
+      <w:pPr>
+        <w:spacing w:before="160" w:after="40"/>
+      </w:pPr>
+      <w:r>
+        <w:rPr>
+          <w:b/>
+          <w:color w:val="888888"/>
+        </w:rPr>
+        <w:t xml:space="preserve">H3: </w:t>
+      </w:r>
+      <w:r>
+        <w:rPr>
+          <w:b/>
+        </w:rPr>
+        <w:t>How do I get a price for my space?</w:t>
+      </w:r>
+    </w:p>
+    <w:p>
+      <w:r>
+        <w:rPr>
+          <w:b w:val="0"/>
+        </w:rPr>
+        <w:t>Request a quote through the site with your size and configuration, and the Skyflex team will come back with the kit price, the colour and the approved-installer option in one go.</w:t>
+      </w:r>
+    </w:p>
+    <w:p>
       <w:r>
         <w:br w:type="page"/>
       </w:r>
@@ -728,7 +1180,7 @@
         <w:rPr>
           <w:i/>
         </w:rPr>
-        <w:t>Rewrite: the content below replaces the current page body.</w:t>
+        <w:t>Product page: use the H1 below to replace the existing product-page title at the top of the page. The rest of the content (from the first H2 down) is added lower on the page, so it starts at H2, not under the H1.</w:t>
       </w:r>
     </w:p>
     <w:p>
@@ -747,6 +1199,24 @@
           <w:b/>
         </w:rPr>
         <w:t>Delta Pro Retractable Roof System Melbourne</w:t>
+      </w:r>
+    </w:p>
+    <w:p>
+      <w:pPr>
+        <w:spacing w:before="160" w:after="40"/>
+      </w:pPr>
+      <w:r>
+        <w:rPr>
+          <w:b/>
+          <w:color w:val="888888"/>
+        </w:rPr>
+        <w:t xml:space="preserve">H2: </w:t>
+      </w:r>
+      <w:r>
+        <w:rPr>
+          <w:b/>
+        </w:rPr>
+        <w:t>A motorised roof for year-round outdoor living</w:t>
       </w:r>
     </w:p>
     <w:p>
@@ -1045,7 +1515,7 @@
         <w:rPr>
           <w:b w:val="0"/>
         </w:rPr>
-        <w:t>Prices swing widely, mostly because these roofs are sold as custom installs quoted per site. The Delta Pro takes the guesswork out: it is supplied from $5,200 for the 3x3 size up to $7,800 for the 6x4, with the figure set by the size, fabric and frame you pick. Fitting is separate and depends on whether you install it yourself or bring in an installer.</w:t>
+        <w:t>Prices swing widely because these roofs are usually sold as custom installs quoted per site. The Delta Pro takes the guesswork out: it is supplied from $5,200 for the 3x3 size up to $7,800 for the 6x4, with the figure set by the size, fabric and frame you pick. Fitting is separate.</w:t>
       </w:r>
     </w:p>
     <w:p>
@@ -1071,7 +1541,7 @@
         <w:rPr>
           <w:b w:val="0"/>
         </w:rPr>
-        <w:t>If you have an outdoor area you only use in good weather, an opening roof turns it into a space that works across the year. You get sun when you want it and a sealed, waterproof cover when you do not, from one structure and one remote. For a patio, deck or poolside that would otherwise sit idle half the time, that is where the value lands.</w:t>
+        <w:t>If you have an outdoor area you only use in good weather, an opening roof turns it into a space that works across the year. You get sun when you want it and a sealed, waterproof cover when you do not, from one structure and one remote.</w:t>
       </w:r>
     </w:p>
     <w:p>
@@ -1097,7 +1567,137 @@
         <w:rPr>
           <w:b w:val="0"/>
         </w:rPr>
-        <w:t>A fabric retractable roof runs on a motor and mains power, so it pays to choose one with a properly sealed drive. The Delta Pro answers that with its IP67-rated Dooya motor and mildew-resistant PVC fabric, so weather and damp are designed out rather than left to chance. The main thing to plan for is the footprint, since this is a free-standing unit that needs clear space to stand over the area you want covered.</w:t>
+        <w:t>A fabric retractable roof runs on a motor and mains power, so it pays to choose one with a properly sealed drive. The Delta Pro answers that with its IP67-rated Dooya motor and mildew-resistant PVC fabric. The main thing to plan for is the footprint, since it is a free-standing unit.</w:t>
+      </w:r>
+    </w:p>
+    <w:p>
+      <w:pPr>
+        <w:spacing w:before="160" w:after="40"/>
+      </w:pPr>
+      <w:r>
+        <w:rPr>
+          <w:b/>
+          <w:color w:val="888888"/>
+        </w:rPr>
+        <w:t xml:space="preserve">H3: </w:t>
+      </w:r>
+      <w:r>
+        <w:rPr>
+          <w:b/>
+        </w:rPr>
+        <w:t>Is the Delta Pro fully waterproof?</w:t>
+      </w:r>
+    </w:p>
+    <w:p>
+      <w:r>
+        <w:rPr>
+          <w:b w:val="0"/>
+        </w:rPr>
+        <w:t>Yes. Closed, the roof seals to 100% waterproof and blocks direct sun, which keeps the space beneath it noticeably cooler through summer.</w:t>
+      </w:r>
+    </w:p>
+    <w:p>
+      <w:pPr>
+        <w:spacing w:before="160" w:after="40"/>
+      </w:pPr>
+      <w:r>
+        <w:rPr>
+          <w:b/>
+          <w:color w:val="888888"/>
+        </w:rPr>
+        <w:t xml:space="preserve">H3: </w:t>
+      </w:r>
+      <w:r>
+        <w:rPr>
+          <w:b/>
+        </w:rPr>
+        <w:t>Can I open and close it when it rains?</w:t>
+      </w:r>
+    </w:p>
+    <w:p>
+      <w:r>
+        <w:rPr>
+          <w:b w:val="0"/>
+        </w:rPr>
+        <w:t>Yes. One handheld remote runs the motorised roof, so you open it to the sun, close it over when the weather turns, or stop it anywhere in between for the shade you want.</w:t>
+      </w:r>
+    </w:p>
+    <w:p>
+      <w:pPr>
+        <w:spacing w:before="160" w:after="40"/>
+      </w:pPr>
+      <w:r>
+        <w:rPr>
+          <w:b/>
+          <w:color w:val="888888"/>
+        </w:rPr>
+        <w:t xml:space="preserve">H3: </w:t>
+      </w:r>
+      <w:r>
+        <w:rPr>
+          <w:b/>
+        </w:rPr>
+        <w:t>Does it need power?</w:t>
+      </w:r>
+    </w:p>
+    <w:p>
+      <w:r>
+        <w:rPr>
+          <w:b w:val="0"/>
+        </w:rPr>
+        <w:t>Yes. The Dooya drive motor is a 40W, DC 24V unit on a standard AU plug-in, sealed to IP67 so it withstands dust and water where it sits out in the weather.</w:t>
+      </w:r>
+    </w:p>
+    <w:p>
+      <w:pPr>
+        <w:spacing w:before="160" w:after="40"/>
+      </w:pPr>
+      <w:r>
+        <w:rPr>
+          <w:b/>
+          <w:color w:val="888888"/>
+        </w:rPr>
+        <w:t xml:space="preserve">H3: </w:t>
+      </w:r>
+      <w:r>
+        <w:rPr>
+          <w:b/>
+        </w:rPr>
+        <w:t>What sizes does it come in?</w:t>
+      </w:r>
+    </w:p>
+    <w:p>
+      <w:r>
+        <w:rPr>
+          <w:b w:val="0"/>
+        </w:rPr>
+        <w:t>The free-standing unit comes in 3x3, 3x4, 3x5, 4x4, 4x5 and 6x4 metres, with fabric in Beige, Black or White and frames in Black, Charcoal or White.</w:t>
+      </w:r>
+    </w:p>
+    <w:p>
+      <w:pPr>
+        <w:spacing w:before="160" w:after="40"/>
+      </w:pPr>
+      <w:r>
+        <w:rPr>
+          <w:b/>
+          <w:color w:val="888888"/>
+        </w:rPr>
+        <w:t xml:space="preserve">H3: </w:t>
+      </w:r>
+      <w:r>
+        <w:rPr>
+          <w:b/>
+        </w:rPr>
+        <w:t>Do I install it myself?</w:t>
+      </w:r>
+    </w:p>
+    <w:p>
+      <w:r>
+        <w:rPr>
+          <w:b w:val="0"/>
+        </w:rPr>
+        <w:t>It is supplied on a buy basis with a 50% deposit to order, so fitting is yours to arrange, either as a capable weekend project or through an approved installer.</w:t>
       </w:r>
     </w:p>
     <w:p>
@@ -1197,7 +1797,7 @@
         <w:rPr>
           <w:i/>
         </w:rPr>
-        <w:t>Rewrite: the content below replaces the current page body.</w:t>
+        <w:t>Product page: use the H1 below to replace the existing product-page title at the top of the page. The rest of the content (from the first H2 down) is added lower on the page, so it starts at H2, not under the H1.</w:t>
       </w:r>
     </w:p>
     <w:p>
@@ -1216,6 +1816,24 @@
           <w:b/>
         </w:rPr>
         <w:t>Delta Commercial Folding Arm: A Retractable Awning Melbourne Buyers Own Outright</w:t>
+      </w:r>
+    </w:p>
+    <w:p>
+      <w:pPr>
+        <w:spacing w:before="160" w:after="40"/>
+      </w:pPr>
+      <w:r>
+        <w:rPr>
+          <w:b/>
+          <w:color w:val="888888"/>
+        </w:rPr>
+        <w:t xml:space="preserve">H2: </w:t>
+      </w:r>
+      <w:r>
+        <w:rPr>
+          <w:b/>
+        </w:rPr>
+        <w:t>The Delta Commercial Folding Arm awning</w:t>
       </w:r>
     </w:p>
     <w:p>
@@ -1498,6 +2116,232 @@
         <w:rPr>
           <w:b/>
         </w:rPr>
+        <w:t>Folding arm awning questions</w:t>
+      </w:r>
+    </w:p>
+    <w:p>
+      <w:pPr>
+        <w:spacing w:before="160" w:after="40"/>
+      </w:pPr>
+      <w:r>
+        <w:rPr>
+          <w:b/>
+          <w:color w:val="888888"/>
+        </w:rPr>
+        <w:t xml:space="preserve">H3: </w:t>
+      </w:r>
+      <w:r>
+        <w:rPr>
+          <w:b/>
+        </w:rPr>
+        <w:t>Is the Delta Commercial Folding Arm weatherproof?</w:t>
+      </w:r>
+    </w:p>
+    <w:p>
+      <w:r>
+        <w:rPr>
+          <w:b w:val="0"/>
+        </w:rPr>
+        <w:t>When it retracts, the fabric and both folding arms seal inside a full aluminium cassette, so the parts that wear are shielded whenever the awning is not extended. The fabric is fade-resistant Dickson and the motor carries an IP67 seal against water and dust.</w:t>
+      </w:r>
+    </w:p>
+    <w:p>
+      <w:pPr>
+        <w:spacing w:before="160" w:after="40"/>
+      </w:pPr>
+      <w:r>
+        <w:rPr>
+          <w:b/>
+          <w:color w:val="888888"/>
+        </w:rPr>
+        <w:t xml:space="preserve">H3: </w:t>
+      </w:r>
+      <w:r>
+        <w:rPr>
+          <w:b/>
+        </w:rPr>
+        <w:t>Is it motorised?</w:t>
+      </w:r>
+    </w:p>
+    <w:p>
+      <w:r>
+        <w:rPr>
+          <w:b w:val="0"/>
+        </w:rPr>
+        <w:t>Yes. A Dooya Silent 40W motor runs it by remote, with an integrated dimmable LED strip set into the cassette at no extra charge.</w:t>
+      </w:r>
+    </w:p>
+    <w:p>
+      <w:pPr>
+        <w:spacing w:before="160" w:after="40"/>
+      </w:pPr>
+      <w:r>
+        <w:rPr>
+          <w:b/>
+          <w:color w:val="888888"/>
+        </w:rPr>
+        <w:t xml:space="preserve">H3: </w:t>
+      </w:r>
+      <w:r>
+        <w:rPr>
+          <w:b/>
+        </w:rPr>
+        <w:t>What sizes does it come in?</w:t>
+      </w:r>
+    </w:p>
+    <w:p>
+      <w:r>
+        <w:rPr>
+          <w:b w:val="0"/>
+        </w:rPr>
+        <w:t>Two sizes, 3000W x 2500P or 4000W x 3000P, in Black or White, with the projection angle adjustable up to 30 degrees to set your shade line.</w:t>
+      </w:r>
+    </w:p>
+    <w:p>
+      <w:pPr>
+        <w:spacing w:before="160" w:after="40"/>
+      </w:pPr>
+      <w:r>
+        <w:rPr>
+          <w:b/>
+          <w:color w:val="888888"/>
+        </w:rPr>
+        <w:t xml:space="preserve">H3: </w:t>
+      </w:r>
+      <w:r>
+        <w:rPr>
+          <w:b/>
+        </w:rPr>
+        <w:t>What fabric is used?</w:t>
+      </w:r>
+    </w:p>
+    <w:p>
+      <w:r>
+        <w:rPr>
+          <w:b w:val="0"/>
+        </w:rPr>
+        <w:t>Fade-resistant Dickson, the long-run benchmark for outdoor awning fabric, on a box body and folding arms in 6063 aluminium alloy.</w:t>
+      </w:r>
+    </w:p>
+    <w:p>
+      <w:pPr>
+        <w:spacing w:before="160" w:after="40"/>
+      </w:pPr>
+      <w:r>
+        <w:rPr>
+          <w:b/>
+          <w:color w:val="888888"/>
+        </w:rPr>
+        <w:t xml:space="preserve">H3: </w:t>
+      </w:r>
+      <w:r>
+        <w:rPr>
+          <w:b/>
+        </w:rPr>
+        <w:t>How is it mounted?</w:t>
+      </w:r>
+    </w:p>
+    <w:p>
+      <w:r>
+        <w:rPr>
+          <w:b w:val="0"/>
+        </w:rPr>
+        <w:t>Wall or ceiling brackets are included, so it suits most frontages. The full-cassette installation manual is included in the box.</w:t>
+      </w:r>
+    </w:p>
+    <w:p>
+      <w:pPr>
+        <w:spacing w:before="160" w:after="40"/>
+      </w:pPr>
+      <w:r>
+        <w:rPr>
+          <w:b/>
+          <w:color w:val="888888"/>
+        </w:rPr>
+        <w:t xml:space="preserve">H3: </w:t>
+      </w:r>
+      <w:r>
+        <w:rPr>
+          <w:b/>
+        </w:rPr>
+        <w:t>Can it be customised?</w:t>
+      </w:r>
+    </w:p>
+    <w:p>
+      <w:r>
+        <w:rPr>
+          <w:b w:val="0"/>
+        </w:rPr>
+        <w:t>If the two standard sizes or colours do not fit your opening, customisation is available on request, with any additional charges quoted before you commit.</w:t>
+      </w:r>
+    </w:p>
+    <w:p>
+      <w:pPr>
+        <w:spacing w:before="160" w:after="40"/>
+      </w:pPr>
+      <w:r>
+        <w:rPr>
+          <w:b/>
+          <w:color w:val="888888"/>
+        </w:rPr>
+        <w:t xml:space="preserve">H3: </w:t>
+      </w:r>
+      <w:r>
+        <w:rPr>
+          <w:b/>
+        </w:rPr>
+        <w:t>Do I install it myself?</w:t>
+      </w:r>
+    </w:p>
+    <w:p>
+      <w:r>
+        <w:rPr>
+          <w:b w:val="0"/>
+        </w:rPr>
+        <w:t>It is sold on a supply basis. You receive the awning and mount it yourself or hand it to your own contractor. Skyflex does not run an install crew for this product, and the pricing reflects that.</w:t>
+      </w:r>
+    </w:p>
+    <w:p>
+      <w:pPr>
+        <w:spacing w:before="160" w:after="40"/>
+      </w:pPr>
+      <w:r>
+        <w:rPr>
+          <w:b/>
+          <w:color w:val="888888"/>
+        </w:rPr>
+        <w:t xml:space="preserve">H3: </w:t>
+      </w:r>
+      <w:r>
+        <w:rPr>
+          <w:b/>
+        </w:rPr>
+        <w:t>How much does it cost?</w:t>
+      </w:r>
+    </w:p>
+    <w:p>
+      <w:r>
+        <w:rPr>
+          <w:b w:val="0"/>
+        </w:rPr>
+        <w:t>Pricing runs from $2,000 to $2,300, supplied, depending on which of the two sizes you choose. It is a pre-order item with a 50% deposit per unit, and orders of five or more qualify for trade pricing.</w:t>
+      </w:r>
+    </w:p>
+    <w:p>
+      <w:pPr>
+        <w:spacing w:before="160" w:after="40"/>
+      </w:pPr>
+      <w:r>
+        <w:rPr>
+          <w:b/>
+          <w:color w:val="888888"/>
+        </w:rPr>
+        <w:t xml:space="preserve">H2: </w:t>
+      </w:r>
+      <w:r>
+        <w:rPr>
+          <w:b/>
+        </w:rPr>
         <w:t>Talk to the Skyflex team</w:t>
       </w:r>
     </w:p>
@@ -1580,7 +2424,7 @@
         <w:rPr>
           <w:i/>
         </w:rPr>
-        <w:t>Rewrite: the content below replaces the current page body.</w:t>
+        <w:t>Product page: use the H1 below to replace the existing product-page title at the top of the page. The rest of the content (from the first H2 down) is added lower on the page, so it starts at H2, not under the H1.</w:t>
       </w:r>
     </w:p>
     <w:p>
@@ -1599,6 +2443,24 @@
           <w:b/>
         </w:rPr>
         <w:t>Skyflex 4K Android Smart Outdoor TV: A Waterproof TV Australia Backyards Can Actually Use</w:t>
+      </w:r>
+    </w:p>
+    <w:p>
+      <w:pPr>
+        <w:spacing w:before="160" w:after="40"/>
+      </w:pPr>
+      <w:r>
+        <w:rPr>
+          <w:b/>
+          <w:color w:val="888888"/>
+        </w:rPr>
+        <w:t xml:space="preserve">H2: </w:t>
+      </w:r>
+      <w:r>
+        <w:rPr>
+          <w:b/>
+        </w:rPr>
+        <w:t>An outdoor TV built to stay outside</w:t>
       </w:r>
     </w:p>
     <w:p>
@@ -1988,7 +2850,7 @@
         <w:rPr>
           <w:b w:val="0"/>
         </w:rPr>
-        <w:t>This one is sealed to IP55, which means dust cannot get inside in a harmful amount and water jets from any direction will not reach the electronics. It is made to stay mounted outdoors through rain and the seasons, unlike an indoor set that needs bringing in or boxing up.</w:t>
+        <w:t>This one is sealed to IP55, which means dust cannot get inside in a harmful amount and water jets from any direction will not reach the electronics. It is made to stay mounted outdoors through rain and the seasons, unlike an indoor set that needs bringing in.</w:t>
       </w:r>
     </w:p>
     <w:p>
@@ -2067,6 +2929,110 @@
           <w:b w:val="0"/>
         </w:rPr>
         <w:t>An indoor TV is not sealed against dust or water and is not bright enough for daylight, so it fails outdoors quickly. A purpose-built unit like this one is sealed, brighter and rated to stay put.</w:t>
+      </w:r>
+    </w:p>
+    <w:p>
+      <w:pPr>
+        <w:spacing w:before="160" w:after="40"/>
+      </w:pPr>
+      <w:r>
+        <w:rPr>
+          <w:b/>
+          <w:color w:val="888888"/>
+        </w:rPr>
+        <w:t xml:space="preserve">H3: </w:t>
+      </w:r>
+      <w:r>
+        <w:rPr>
+          <w:b/>
+        </w:rPr>
+        <w:t>What sizes does it come in?</w:t>
+      </w:r>
+    </w:p>
+    <w:p>
+      <w:r>
+        <w:rPr>
+          <w:b w:val="0"/>
+        </w:rPr>
+        <w:t>Four sizes: 55, 65, 75 and 85 inch. All run 4K UHD at 3840 x 2160 on Google Android TV.</w:t>
+      </w:r>
+    </w:p>
+    <w:p>
+      <w:pPr>
+        <w:spacing w:before="160" w:after="40"/>
+      </w:pPr>
+      <w:r>
+        <w:rPr>
+          <w:b/>
+          <w:color w:val="888888"/>
+        </w:rPr>
+        <w:t xml:space="preserve">H3: </w:t>
+      </w:r>
+      <w:r>
+        <w:rPr>
+          <w:b/>
+        </w:rPr>
+        <w:t>What operating system does it run?</w:t>
+      </w:r>
+    </w:p>
+    <w:p>
+      <w:r>
+        <w:rPr>
+          <w:b w:val="0"/>
+        </w:rPr>
+        <w:t>Google Android TV, with a 100 Hz refresh rate, built-in waterproof speakers, and three HDMI plus two USB inputs.</w:t>
+      </w:r>
+    </w:p>
+    <w:p>
+      <w:pPr>
+        <w:spacing w:before="160" w:after="40"/>
+      </w:pPr>
+      <w:r>
+        <w:rPr>
+          <w:b/>
+          <w:color w:val="888888"/>
+        </w:rPr>
+        <w:t xml:space="preserve">H3: </w:t>
+      </w:r>
+      <w:r>
+        <w:rPr>
+          <w:b/>
+        </w:rPr>
+        <w:t>How does pre-order work?</w:t>
+      </w:r>
+    </w:p>
+    <w:p>
+      <w:r>
+        <w:rPr>
+          <w:b w:val="0"/>
+        </w:rPr>
+        <w:t>It ships as a pre-order item. A 50% deposit per unit places the order, and the balance follows before dispatch. Buying five or more for a venue or a fit-out opens trade pricing.</w:t>
+      </w:r>
+    </w:p>
+    <w:p>
+      <w:pPr>
+        <w:spacing w:before="160" w:after="40"/>
+      </w:pPr>
+      <w:r>
+        <w:rPr>
+          <w:b/>
+          <w:color w:val="888888"/>
+        </w:rPr>
+        <w:t xml:space="preserve">H3: </w:t>
+      </w:r>
+      <w:r>
+        <w:rPr>
+          <w:b/>
+        </w:rPr>
+        <w:t>Do I mount it myself?</w:t>
+      </w:r>
+    </w:p>
+    <w:p>
+      <w:r>
+        <w:rPr>
+          <w:b w:val="0"/>
+        </w:rPr>
+        <w:t>It is supplied wall-mount compatible, so you or your installer mount it. With no bundled install cost, the same outdoor-TV specification lands well below many competing systems.</w:t>
       </w:r>
     </w:p>
     <w:p>
@@ -2166,7 +3132,7 @@
         <w:rPr>
           <w:i/>
         </w:rPr>
-        <w:t>Rewrite: the content below replaces the current page body.</w:t>
+        <w:t>Product page: use the H1 below to replace the existing product-page title at the top of the page. The rest of the content (from the first H2 down) is added lower on the page, so it starts at H2, not under the H1.</w:t>
       </w:r>
     </w:p>
     <w:p>
@@ -2185,6 +3151,24 @@
           <w:b/>
         </w:rPr>
         <w:t>Skyflex BBQ Pods Melbourne: An Outdoor Kitchen Made to Your Configuration</w:t>
+      </w:r>
+    </w:p>
+    <w:p>
+      <w:pPr>
+        <w:spacing w:before="160" w:after="40"/>
+      </w:pPr>
+      <w:r>
+        <w:rPr>
+          <w:b/>
+          <w:color w:val="888888"/>
+        </w:rPr>
+        <w:t xml:space="preserve">H2: </w:t>
+      </w:r>
+      <w:r>
+        <w:rPr>
+          <w:b/>
+        </w:rPr>
+        <w:t>The Skyflex BBQ pod</w:t>
       </w:r>
     </w:p>
     <w:p>
@@ -2384,6 +3368,232 @@
         <w:rPr>
           <w:b/>
         </w:rPr>
+        <w:t>BBQ pod questions</w:t>
+      </w:r>
+    </w:p>
+    <w:p>
+      <w:pPr>
+        <w:spacing w:before="160" w:after="40"/>
+      </w:pPr>
+      <w:r>
+        <w:rPr>
+          <w:b/>
+          <w:color w:val="888888"/>
+        </w:rPr>
+        <w:t xml:space="preserve">H3: </w:t>
+      </w:r>
+      <w:r>
+        <w:rPr>
+          <w:b/>
+        </w:rPr>
+        <w:t>How much does a Skyflex BBQ pod cost?</w:t>
+      </w:r>
+    </w:p>
+    <w:p>
+      <w:r>
+        <w:rPr>
+          <w:b w:val="0"/>
+        </w:rPr>
+        <w:t>It is a custom order that starts from $13,500. Treat that as a starting point rather than a final quote, because the finished price follows the size you pick and the way you fit the pod out.</w:t>
+      </w:r>
+    </w:p>
+    <w:p>
+      <w:pPr>
+        <w:spacing w:before="160" w:after="40"/>
+      </w:pPr>
+      <w:r>
+        <w:rPr>
+          <w:b/>
+          <w:color w:val="888888"/>
+        </w:rPr>
+        <w:t xml:space="preserve">H3: </w:t>
+      </w:r>
+      <w:r>
+        <w:rPr>
+          <w:b/>
+        </w:rPr>
+        <w:t>Can I buy a BBQ pod online?</w:t>
+      </w:r>
+    </w:p>
+    <w:p>
+      <w:r>
+        <w:rPr>
+          <w:b w:val="0"/>
+        </w:rPr>
+        <w:t>No. It is a custom-order product, not available for direct online purchase, so pricing, delivery and any customisation are settled by speaking with the team first. There is no add-to-cart button, and that is deliberate.</w:t>
+      </w:r>
+    </w:p>
+    <w:p>
+      <w:pPr>
+        <w:spacing w:before="160" w:after="40"/>
+      </w:pPr>
+      <w:r>
+        <w:rPr>
+          <w:b/>
+          <w:color w:val="888888"/>
+        </w:rPr>
+        <w:t xml:space="preserve">H3: </w:t>
+      </w:r>
+      <w:r>
+        <w:rPr>
+          <w:b/>
+        </w:rPr>
+        <w:t>What sizes are available?</w:t>
+      </w:r>
+    </w:p>
+    <w:p>
+      <w:r>
+        <w:rPr>
+          <w:b w:val="0"/>
+        </w:rPr>
+        <w:t>Two footprints, both standing 2.3 metres tall: 2200w x 2300h x 770w for a courtyard or a tighter alfresco corner, and 2850w x 2300h x 770w for a larger space.</w:t>
+      </w:r>
+    </w:p>
+    <w:p>
+      <w:pPr>
+        <w:spacing w:before="160" w:after="40"/>
+      </w:pPr>
+      <w:r>
+        <w:rPr>
+          <w:b/>
+          <w:color w:val="888888"/>
+        </w:rPr>
+        <w:t xml:space="preserve">H3: </w:t>
+      </w:r>
+      <w:r>
+        <w:rPr>
+          <w:b/>
+        </w:rPr>
+        <w:t>Is the pod built to stay outdoors?</w:t>
+      </w:r>
+    </w:p>
+    <w:p>
+      <w:r>
+        <w:rPr>
+          <w:b w:val="0"/>
+        </w:rPr>
+        <w:t>Yes. It lives outdoors permanently, and the finish and the way it is fitted out are confirmed with you during the consultation so the weather-facing build is matched to where the pod will stand.</w:t>
+      </w:r>
+    </w:p>
+    <w:p>
+      <w:pPr>
+        <w:spacing w:before="160" w:after="40"/>
+      </w:pPr>
+      <w:r>
+        <w:rPr>
+          <w:b/>
+          <w:color w:val="888888"/>
+        </w:rPr>
+        <w:t xml:space="preserve">H3: </w:t>
+      </w:r>
+      <w:r>
+        <w:rPr>
+          <w:b/>
+        </w:rPr>
+        <w:t>How does the consultation work?</w:t>
+      </w:r>
+    </w:p>
+    <w:p>
+      <w:r>
+        <w:rPr>
+          <w:b w:val="0"/>
+        </w:rPr>
+        <w:t>You tell us the space and the brief, and we tailor the pod to where it will stand and how hard it will be worked, then come back with a real number rather than a guess.</w:t>
+      </w:r>
+    </w:p>
+    <w:p>
+      <w:pPr>
+        <w:spacing w:before="160" w:after="40"/>
+      </w:pPr>
+      <w:r>
+        <w:rPr>
+          <w:b/>
+          <w:color w:val="888888"/>
+        </w:rPr>
+        <w:t xml:space="preserve">H3: </w:t>
+      </w:r>
+      <w:r>
+        <w:rPr>
+          <w:b/>
+        </w:rPr>
+        <w:t>How does a pod compare to a custom-built outdoor kitchen?</w:t>
+      </w:r>
+    </w:p>
+    <w:p>
+      <w:r>
+        <w:rPr>
+          <w:b w:val="0"/>
+        </w:rPr>
+        <w:t>Buying a configured pod direct, rather than a bundled design-and-install package, is a large part of what keeps the entry price where it is. Comparable pods on the market are commonly advertised from around $18,990 upward.</w:t>
+      </w:r>
+    </w:p>
+    <w:p>
+      <w:pPr>
+        <w:spacing w:before="160" w:after="40"/>
+      </w:pPr>
+      <w:r>
+        <w:rPr>
+          <w:b/>
+          <w:color w:val="888888"/>
+        </w:rPr>
+        <w:t xml:space="preserve">H3: </w:t>
+      </w:r>
+      <w:r>
+        <w:rPr>
+          <w:b/>
+        </w:rPr>
+        <w:t>Can I choose the layout and finish?</w:t>
+      </w:r>
+    </w:p>
+    <w:p>
+      <w:r>
+        <w:rPr>
+          <w:b w:val="0"/>
+        </w:rPr>
+        <w:t>Yes. A made-to-configuration pod leaves the important details open until you have chosen them, so the finish and fit-out suit your space rather than a single spec sheet.</w:t>
+      </w:r>
+    </w:p>
+    <w:p>
+      <w:pPr>
+        <w:spacing w:before="160" w:after="40"/>
+      </w:pPr>
+      <w:r>
+        <w:rPr>
+          <w:b/>
+          <w:color w:val="888888"/>
+        </w:rPr>
+        <w:t xml:space="preserve">H3: </w:t>
+      </w:r>
+      <w:r>
+        <w:rPr>
+          <w:b/>
+        </w:rPr>
+        <w:t>How do I get started?</w:t>
+      </w:r>
+    </w:p>
+    <w:p>
+      <w:r>
+        <w:rPr>
+          <w:b w:val="0"/>
+        </w:rPr>
+        <w:t>Call the Skyflex team on 03 9498 0505, email info@skyflex.au, or book a showroom visit in Epping to start the consultation.</w:t>
+      </w:r>
+    </w:p>
+    <w:p>
+      <w:pPr>
+        <w:spacing w:before="160" w:after="40"/>
+      </w:pPr>
+      <w:r>
+        <w:rPr>
+          <w:b/>
+          <w:color w:val="888888"/>
+        </w:rPr>
+        <w:t xml:space="preserve">H2: </w:t>
+      </w:r>
+      <w:r>
+        <w:rPr>
+          <w:b/>
+        </w:rPr>
         <w:t>Book a BBQ pod consultation</w:t>
       </w:r>
     </w:p>
@@ -2807,7 +4017,7 @@
         <w:rPr>
           <w:b w:val="0"/>
         </w:rPr>
-        <w:t>Opinions genuinely split. Some owners call it worth every cent for the daily comfort, while others decide the cost is not justified for their household. The wash, warm seat and dryer are what long-term owners rave about; if those matter to you, the value follows. If they do not, a standard suite is the sensible call.</w:t>
+        <w:t>Opinions genuinely split. Some owners call it worth every cent for the daily comfort, while others decide the cost is not justified for their household. The wash, warm seat and dryer are what long-term owners rave about. If those matter to you, the value follows.</w:t>
       </w:r>
     </w:p>
     <w:p>
@@ -2860,6 +4070,32 @@
           <w:b w:val="0"/>
         </w:rPr>
         <w:t>The main ones are the upfront cost, the need for a power point and possibly an electrician, and the fact that the wash, dryer and heated seat depend on power. There are more electronic parts than a standard toilet, so servicing is a consideration over the years.</w:t>
+      </w:r>
+    </w:p>
+    <w:p>
+      <w:pPr>
+        <w:spacing w:before="160" w:after="40"/>
+      </w:pPr>
+      <w:r>
+        <w:rPr>
+          <w:b/>
+          <w:color w:val="888888"/>
+        </w:rPr>
+        <w:t xml:space="preserve">H3: </w:t>
+      </w:r>
+      <w:r>
+        <w:rPr>
+          <w:b/>
+        </w:rPr>
+        <w:t>How is a smart toilet installed?</w:t>
+      </w:r>
+    </w:p>
+    <w:p>
+      <w:r>
+        <w:rPr>
+          <w:b w:val="0"/>
+        </w:rPr>
+        <w:t>It needs a plumber for the water connection and, in many bathrooms, an electrician to add a power point near the pan. If your bathroom has no outlet close by, factor that work into the budget from the start.</w:t>
       </w:r>
     </w:p>
     <w:p>

</xml_diff>

<commit_message>
skyflex.au — add 'Who it is for' audience/use-case section to all 7 pages (AEO/GEO: helps LLMs + search engines understand target audience; grounded in forms ideal-customer + product fit; includes who-it-is-not-for on TV/awning/roof/bbq/smart-toilets); 0 blocking, humanity/diff 100, coherence clean; re-approved; deliverables rebuilt
</commit_message>
<xml_diff>
--- a/clients/skyflex.au/content/exports/delivery-2026-07-16T05-22/skyflex-content-deliverable.docx
+++ b/clients/skyflex.au/content/exports/delivery-2026-07-16T05-22/skyflex-content-deliverable.docx
@@ -414,6 +414,32 @@
         <w:rPr>
           <w:b/>
         </w:rPr>
+        <w:t>Who a Skyflex louvred pergola suits</w:t>
+      </w:r>
+    </w:p>
+    <w:p>
+      <w:r>
+        <w:rPr>
+          <w:b w:val="0"/>
+        </w:rPr>
+        <w:t>Skyflex louvred pergolas suit Melbourne homeowners and businesses who want an outdoor space they can use all year, not only on still, sunny days. They fit the DIY enthusiast happy to assemble a kit over a weekend just as well as the owner who would rather an approved installer handled it. At home the common settings are backyards, patios and gardens; cafes, restaurants and other commercial properties use them to make an outdoor area work in any weather. If you value durability and a fixed, upfront price over an open-ended bespoke build, this is the range built for that.</w:t>
+      </w:r>
+    </w:p>
+    <w:p>
+      <w:pPr>
+        <w:spacing w:before="160" w:after="40"/>
+      </w:pPr>
+      <w:r>
+        <w:rPr>
+          <w:b/>
+          <w:color w:val="888888"/>
+        </w:rPr>
+        <w:t xml:space="preserve">H2: </w:t>
+      </w:r>
+      <w:r>
+        <w:rPr>
+          <w:b/>
+        </w:rPr>
         <w:t>Louvred pergola questions Melbourne buyers ask</w:t>
       </w:r>
     </w:p>
@@ -898,6 +924,32 @@
         <w:rPr>
           <w:b/>
         </w:rPr>
+        <w:t>Who a Skyflex pergola in Sydney suits</w:t>
+      </w:r>
+    </w:p>
+    <w:p>
+      <w:r>
+        <w:rPr>
+          <w:b w:val="0"/>
+        </w:rPr>
+        <w:t>A Skyflex pergola suits Sydney homeowners and businesses who want a quality louvred pergola without commissioning a bespoke on-site build. Because it ships as a kit and is fitted through approved installers, it works for the hands-on owner who will assemble it and for the buyer who would rather an installer took it on. It is the right fit if you want a fixed, upfront price and a product engineered for the weather, rather than an open-ended custom quote.</w:t>
+      </w:r>
+    </w:p>
+    <w:p>
+      <w:pPr>
+        <w:spacing w:before="160" w:after="40"/>
+      </w:pPr>
+      <w:r>
+        <w:rPr>
+          <w:b/>
+          <w:color w:val="888888"/>
+        </w:rPr>
+        <w:t xml:space="preserve">H2: </w:t>
+      </w:r>
+      <w:r>
+        <w:rPr>
+          <w:b/>
+        </w:rPr>
         <w:t>Pergola questions from Sydney buyers</w:t>
       </w:r>
     </w:p>
@@ -1489,6 +1541,32 @@
         <w:rPr>
           <w:b/>
         </w:rPr>
+        <w:t>Who the Delta Pro is best for</w:t>
+      </w:r>
+    </w:p>
+    <w:p>
+      <w:r>
+        <w:rPr>
+          <w:b w:val="0"/>
+        </w:rPr>
+        <w:t>The Delta Pro is best for anyone with a patio, deck, poolside corner or open area that has nothing over it and who wants shade on a hot day and cover when it rains, from one structure. Because it is free-standing and carries a published price, it suits buyers who want a fixed cost and a product they can order today rather than a custom install quoted per site. It fits a capable DIY owner or someone who would rather bring in an installer, and anyone who uses an outdoor area often enough that losing it to the weather is a real cost. If your space already has a solid roof over it, a fixed awning or blind may suit better.</w:t>
+      </w:r>
+    </w:p>
+    <w:p>
+      <w:pPr>
+        <w:spacing w:before="160" w:after="40"/>
+      </w:pPr>
+      <w:r>
+        <w:rPr>
+          <w:b/>
+          <w:color w:val="888888"/>
+        </w:rPr>
+        <w:t xml:space="preserve">H2: </w:t>
+      </w:r>
+      <w:r>
+        <w:rPr>
+          <w:b/>
+        </w:rPr>
         <w:t>Common questions about retractable roofs</w:t>
       </w:r>
     </w:p>
@@ -2116,6 +2194,32 @@
         <w:rPr>
           <w:b/>
         </w:rPr>
+        <w:t>Who the Delta Commercial Folding Arm suits</w:t>
+      </w:r>
+    </w:p>
+    <w:p>
+      <w:r>
+        <w:rPr>
+          <w:b w:val="0"/>
+        </w:rPr>
+        <w:t>The Delta Commercial Folding Arm suits buyers who want a folding-arm awning built to last outdoors rather than the cheapest option on the shelf. The full cassette makes it a strong fit for a cafe or shopfront frontage, a deck exposed to Melbourne's swing from sun to sudden shower, or a home alfresco you want to keep for years. Because it is supplied for you or your contractor to fit, it works for owners comfortable arranging their own installation and keen to avoid a bundled measure-and-install cost. If you want a lightweight, occasional-use patio arm at the lowest price, an open folding arm will be cheaper.</w:t>
+      </w:r>
+    </w:p>
+    <w:p>
+      <w:pPr>
+        <w:spacing w:before="160" w:after="40"/>
+      </w:pPr>
+      <w:r>
+        <w:rPr>
+          <w:b/>
+          <w:color w:val="888888"/>
+        </w:rPr>
+        <w:t xml:space="preserve">H2: </w:t>
+      </w:r>
+      <w:r>
+        <w:rPr>
+          <w:b/>
+        </w:rPr>
         <w:t>Folding arm awning questions</w:t>
       </w:r>
     </w:p>
@@ -2824,6 +2928,32 @@
         <w:rPr>
           <w:b/>
         </w:rPr>
+        <w:t>Who the Skyflex outdoor TV is best for</w:t>
+      </w:r>
+    </w:p>
+    <w:p>
+      <w:r>
+        <w:rPr>
+          <w:b w:val="0"/>
+        </w:rPr>
+        <w:t>This TV is best for a covered or partly shaded outdoor spot: a roofed alfresco, a verandah, a pergola, or a corner that catches only glancing light. It suits homeowners who already have a shaded entertaining area and want a screen that can stay mounted outside through the seasons. It is not the right choice for a wall in open, direct sun through the middle of the day, where a brighter panel built for full sun performs better. If your spot has something overhead, this is the screen for it.</w:t>
+      </w:r>
+    </w:p>
+    <w:p>
+      <w:pPr>
+        <w:spacing w:before="160" w:after="40"/>
+      </w:pPr>
+      <w:r>
+        <w:rPr>
+          <w:b/>
+          <w:color w:val="888888"/>
+        </w:rPr>
+        <w:t xml:space="preserve">H2: </w:t>
+      </w:r>
+      <w:r>
+        <w:rPr>
+          <w:b/>
+        </w:rPr>
         <w:t>Questions buyers ask before going outdoors</w:t>
       </w:r>
     </w:p>
@@ -3368,6 +3498,32 @@
         <w:rPr>
           <w:b/>
         </w:rPr>
+        <w:t>Who a Skyflex BBQ pod is for</w:t>
+      </w:r>
+    </w:p>
+    <w:p>
+      <w:r>
+        <w:rPr>
+          <w:b w:val="0"/>
+        </w:rPr>
+        <w:t>A Skyflex BBQ pod is for homeowners and venues planning a premium outdoor kitchen who want it configured to their space rather than bought off a shelf or built bespoke on site. It is a considered purchase settled through a consultation, so it suits buyers who want to tailor the size, finish and fit-out and are comfortable with a made-to-order timeline. If you want the look and function of a custom outdoor kitchen at a lower entry price than a fully bespoke build, this is the route. For a small, off-the-shelf grill on a budget, it is more than you need.</w:t>
+      </w:r>
+    </w:p>
+    <w:p>
+      <w:pPr>
+        <w:spacing w:before="160" w:after="40"/>
+      </w:pPr>
+      <w:r>
+        <w:rPr>
+          <w:b/>
+          <w:color w:val="888888"/>
+        </w:rPr>
+        <w:t xml:space="preserve">H2: </w:t>
+      </w:r>
+      <w:r>
+        <w:rPr>
+          <w:b/>
+        </w:rPr>
         <w:t>BBQ pod questions</w:t>
       </w:r>
     </w:p>
@@ -3974,6 +4130,32 @@
           <w:b w:val="0"/>
         </w:rPr>
         <w:t>Skyflex was founded in 2023 by Christopher Mitsopoulos and is based in Melbourne, working with homeowners and businesses across the city and in Sydney. The core of the business is outdoor living, and smart toilets are a category we have added to that range, so we will be straight with you: we are not a decades-old bathroom specialist, and this page reflects that. What we can point to is a customer base that has grown past 100, with about half of all new business coming through referrals from people who bought from us and told someone else. Our showroom is in Epping and open by appointment, and the same team that answers the phone handles your enquiry from the first question to delivery.</w:t>
+      </w:r>
+    </w:p>
+    <w:p>
+      <w:pPr>
+        <w:spacing w:before="160" w:after="40"/>
+      </w:pPr>
+      <w:r>
+        <w:rPr>
+          <w:b/>
+          <w:color w:val="888888"/>
+        </w:rPr>
+        <w:t xml:space="preserve">H2: </w:t>
+      </w:r>
+      <w:r>
+        <w:rPr>
+          <w:b/>
+        </w:rPr>
+        <w:t>Who a smart toilet is best for</w:t>
+      </w:r>
+    </w:p>
+    <w:p>
+      <w:r>
+        <w:rPr>
+          <w:b w:val="0"/>
+        </w:rPr>
+        <w:t>A smart toilet is best for buyers who value the daily comfort of a warm seat, a warm-water wash and a dryer, and who are renovating or building where the plumbing and a power point can be planned in. The U6 and U7 suit a household happy to add an electrical outlet near the pan if there is not one already. It is less suited to anyone unwilling to run power to the toilet, or who does not want the extra electronic parts to maintain over the years. If the wash and warm seat appeal and the bathroom can take a power point, the value follows.</w:t>
       </w:r>
     </w:p>
     <w:p>

</xml_diff>

<commit_message>
skyflex.au — conversion reorder: move 'Who it is for' audience section from after-About to right after product substance (before pricing on product pages, before About on pergola/category pages) so visitors self-qualify before the price/trust close; 0 blocking, coherence clean; re-approved; deliverables rebuilt
</commit_message>
<xml_diff>
--- a/clients/skyflex.au/content/exports/delivery-2026-07-16T05-22/skyflex-content-deliverable.docx
+++ b/clients/skyflex.au/content/exports/delivery-2026-07-16T05-22/skyflex-content-deliverable.docx
@@ -319,7 +319,7 @@
         <w:rPr>
           <w:b/>
         </w:rPr>
-        <w:t>About Skyflex</w:t>
+        <w:t>Who a Skyflex louvred pergola suits</w:t>
       </w:r>
     </w:p>
     <w:p>
@@ -327,76 +327,7 @@
         <w:rPr>
           <w:b w:val="0"/>
         </w:rPr>
-        <w:t>Skyflex was founded in 2023 by Christopher Mitsopoulos and has since supplied more than 100 customers. Around half of every new job now comes through a customer referral, which for a business this young is the clearest sign the product holds up. A few specifics behind that:</w:t>
-      </w:r>
-    </w:p>
-    <w:p>
-      <w:pPr>
-        <w:pStyle w:val="ListBullet"/>
-      </w:pPr>
-      <w:r>
-        <w:rPr>
-          <w:b w:val="0"/>
-        </w:rPr>
-        <w:t>Up to a 15-year product warranty, well beyond the 1 to 5 years common across the market.</w:t>
-      </w:r>
-    </w:p>
-    <w:p>
-      <w:pPr>
-        <w:pStyle w:val="ListBullet"/>
-      </w:pPr>
-      <w:r>
-        <w:rPr>
-          <w:b w:val="0"/>
-        </w:rPr>
-        <w:t>The Delta Light Motorised was voted Australia's most affordable motorised louvre roof system, from $2,700.</w:t>
-      </w:r>
-    </w:p>
-    <w:p>
-      <w:pPr>
-        <w:pStyle w:val="ListBullet"/>
-      </w:pPr>
-      <w:r>
-        <w:rPr>
-          <w:b w:val="0"/>
-        </w:rPr>
-        <w:t>Double-walled louvre blades with gasket weather sealing, a step past the double-walled blades others ship with no seal at all.</w:t>
-      </w:r>
-    </w:p>
-    <w:p>
-      <w:pPr>
-        <w:pStyle w:val="ListBullet"/>
-      </w:pPr>
-      <w:r>
-        <w:rPr>
-          <w:b w:val="0"/>
-        </w:rPr>
-        <w:t>150x150 posts where most systems use 110 or 120, held by a hidden anchoring design for a clean, floating look.</w:t>
-      </w:r>
-    </w:p>
-    <w:p>
-      <w:r>
-        <w:rPr>
-          <w:b w:val="0"/>
-        </w:rPr>
-        <w:t>The products are designed in Europe with ethically sourced components and made fully customisable to your space. See the range in person at our Epping showroom, order a DIY kit, or request a quote for a custom project, and the Skyflex team will match it to the right model and finish.</w:t>
-      </w:r>
-    </w:p>
-    <w:p>
-      <w:pPr>
-        <w:spacing w:before="80"/>
-      </w:pPr>
-      <w:r>
-        <w:rPr>
-          <w:b/>
-        </w:rPr>
-        <w:t>Call us now on 03 9498 0505</w:t>
-      </w:r>
-      <w:r>
-        <w:rPr>
-          <w:b w:val="0"/>
-        </w:rPr>
-        <w:t xml:space="preserve"> to get started.</w:t>
+        <w:t>Skyflex louvred pergolas suit Melbourne homeowners and businesses who want an outdoor space they can use all year, not only on still, sunny days. They fit the DIY enthusiast happy to assemble a kit over a weekend just as well as the owner who would rather an approved installer handled it. At home the common settings are backyards, patios and gardens; cafes, restaurants and other commercial properties use them to make an outdoor area work in any weather. If you value durability and a fixed, upfront price over an open-ended bespoke build, this is the range built for that.</w:t>
       </w:r>
     </w:p>
     <w:p>
@@ -414,7 +345,7 @@
         <w:rPr>
           <w:b/>
         </w:rPr>
-        <w:t>Who a Skyflex louvred pergola suits</w:t>
+        <w:t>About Skyflex</w:t>
       </w:r>
     </w:p>
     <w:p>
@@ -422,7 +353,76 @@
         <w:rPr>
           <w:b w:val="0"/>
         </w:rPr>
-        <w:t>Skyflex louvred pergolas suit Melbourne homeowners and businesses who want an outdoor space they can use all year, not only on still, sunny days. They fit the DIY enthusiast happy to assemble a kit over a weekend just as well as the owner who would rather an approved installer handled it. At home the common settings are backyards, patios and gardens; cafes, restaurants and other commercial properties use them to make an outdoor area work in any weather. If you value durability and a fixed, upfront price over an open-ended bespoke build, this is the range built for that.</w:t>
+        <w:t>Skyflex was founded in 2023 by Christopher Mitsopoulos and has since supplied more than 100 customers. Around half of every new job now comes through a customer referral, which for a business this young is the clearest sign the product holds up. A few specifics behind that:</w:t>
+      </w:r>
+    </w:p>
+    <w:p>
+      <w:pPr>
+        <w:pStyle w:val="ListBullet"/>
+      </w:pPr>
+      <w:r>
+        <w:rPr>
+          <w:b w:val="0"/>
+        </w:rPr>
+        <w:t>Up to a 15-year product warranty, well beyond the 1 to 5 years common across the market.</w:t>
+      </w:r>
+    </w:p>
+    <w:p>
+      <w:pPr>
+        <w:pStyle w:val="ListBullet"/>
+      </w:pPr>
+      <w:r>
+        <w:rPr>
+          <w:b w:val="0"/>
+        </w:rPr>
+        <w:t>The Delta Light Motorised was voted Australia's most affordable motorised louvre roof system, from $2,700.</w:t>
+      </w:r>
+    </w:p>
+    <w:p>
+      <w:pPr>
+        <w:pStyle w:val="ListBullet"/>
+      </w:pPr>
+      <w:r>
+        <w:rPr>
+          <w:b w:val="0"/>
+        </w:rPr>
+        <w:t>Double-walled louvre blades with gasket weather sealing, a step past the double-walled blades others ship with no seal at all.</w:t>
+      </w:r>
+    </w:p>
+    <w:p>
+      <w:pPr>
+        <w:pStyle w:val="ListBullet"/>
+      </w:pPr>
+      <w:r>
+        <w:rPr>
+          <w:b w:val="0"/>
+        </w:rPr>
+        <w:t>150x150 posts where most systems use 110 or 120, held by a hidden anchoring design for a clean, floating look.</w:t>
+      </w:r>
+    </w:p>
+    <w:p>
+      <w:r>
+        <w:rPr>
+          <w:b w:val="0"/>
+        </w:rPr>
+        <w:t>The products are designed in Europe with ethically sourced components and made fully customisable to your space. See the range in person at our Epping showroom, order a DIY kit, or request a quote for a custom project, and the Skyflex team will match it to the right model and finish.</w:t>
+      </w:r>
+    </w:p>
+    <w:p>
+      <w:pPr>
+        <w:spacing w:before="80"/>
+      </w:pPr>
+      <w:r>
+        <w:rPr>
+          <w:b/>
+        </w:rPr>
+        <w:t>Call us now on 03 9498 0505</w:t>
+      </w:r>
+      <w:r>
+        <w:rPr>
+          <w:b w:val="0"/>
+        </w:rPr>
+        <w:t xml:space="preserve"> to get started.</w:t>
       </w:r>
     </w:p>
     <w:p>
@@ -858,6 +858,32 @@
         <w:rPr>
           <w:b/>
         </w:rPr>
+        <w:t>Who a Skyflex pergola in Sydney suits</w:t>
+      </w:r>
+    </w:p>
+    <w:p>
+      <w:r>
+        <w:rPr>
+          <w:b w:val="0"/>
+        </w:rPr>
+        <w:t>A Skyflex pergola suits Sydney homeowners and businesses who want a quality louvred pergola without commissioning a bespoke on-site build. Because it ships as a kit and is fitted through approved installers, it works for the hands-on owner who will assemble it and for the buyer who would rather an installer took it on. It is the right fit if you want a fixed, upfront price and a product engineered for the weather, rather than an open-ended custom quote.</w:t>
+      </w:r>
+    </w:p>
+    <w:p>
+      <w:pPr>
+        <w:spacing w:before="160" w:after="40"/>
+      </w:pPr>
+      <w:r>
+        <w:rPr>
+          <w:b/>
+          <w:color w:val="888888"/>
+        </w:rPr>
+        <w:t xml:space="preserve">H2: </w:t>
+      </w:r>
+      <w:r>
+        <w:rPr>
+          <w:b/>
+        </w:rPr>
         <w:t>About Skyflex</w:t>
       </w:r>
     </w:p>
@@ -924,32 +950,6 @@
         <w:rPr>
           <w:b/>
         </w:rPr>
-        <w:t>Who a Skyflex pergola in Sydney suits</w:t>
-      </w:r>
-    </w:p>
-    <w:p>
-      <w:r>
-        <w:rPr>
-          <w:b w:val="0"/>
-        </w:rPr>
-        <w:t>A Skyflex pergola suits Sydney homeowners and businesses who want a quality louvred pergola without commissioning a bespoke on-site build. Because it ships as a kit and is fitted through approved installers, it works for the hands-on owner who will assemble it and for the buyer who would rather an installer took it on. It is the right fit if you want a fixed, upfront price and a product engineered for the weather, rather than an open-ended custom quote.</w:t>
-      </w:r>
-    </w:p>
-    <w:p>
-      <w:pPr>
-        <w:spacing w:before="160" w:after="40"/>
-      </w:pPr>
-      <w:r>
-        <w:rPr>
-          <w:b/>
-          <w:color w:val="888888"/>
-        </w:rPr>
-        <w:t xml:space="preserve">H2: </w:t>
-      </w:r>
-      <w:r>
-        <w:rPr>
-          <w:b/>
-        </w:rPr>
         <w:t>Pergola questions from Sydney buyers</w:t>
       </w:r>
     </w:p>
@@ -1451,6 +1451,32 @@
         <w:rPr>
           <w:b/>
         </w:rPr>
+        <w:t>Who the Delta Pro is best for</w:t>
+      </w:r>
+    </w:p>
+    <w:p>
+      <w:r>
+        <w:rPr>
+          <w:b w:val="0"/>
+        </w:rPr>
+        <w:t>The Delta Pro is best for anyone with a patio, deck, poolside corner or open area that has nothing over it and who wants shade on a hot day and cover when it rains, from one structure. Because it is free-standing and carries a published price, it suits buyers who want a fixed cost and a product they can order today rather than a custom install quoted per site. It fits a capable DIY owner or someone who would rather bring in an installer, and anyone who uses an outdoor area often enough that losing it to the weather is a real cost. If your space already has a solid roof over it, a fixed awning or blind may suit better.</w:t>
+      </w:r>
+    </w:p>
+    <w:p>
+      <w:pPr>
+        <w:spacing w:before="160" w:after="40"/>
+      </w:pPr>
+      <w:r>
+        <w:rPr>
+          <w:b/>
+          <w:color w:val="888888"/>
+        </w:rPr>
+        <w:t xml:space="preserve">H2: </w:t>
+      </w:r>
+      <w:r>
+        <w:rPr>
+          <w:b/>
+        </w:rPr>
         <w:t>A retractable roof pergola you can order today</w:t>
       </w:r>
     </w:p>
@@ -1541,32 +1567,6 @@
         <w:rPr>
           <w:b/>
         </w:rPr>
-        <w:t>Who the Delta Pro is best for</w:t>
-      </w:r>
-    </w:p>
-    <w:p>
-      <w:r>
-        <w:rPr>
-          <w:b w:val="0"/>
-        </w:rPr>
-        <w:t>The Delta Pro is best for anyone with a patio, deck, poolside corner or open area that has nothing over it and who wants shade on a hot day and cover when it rains, from one structure. Because it is free-standing and carries a published price, it suits buyers who want a fixed cost and a product they can order today rather than a custom install quoted per site. It fits a capable DIY owner or someone who would rather bring in an installer, and anyone who uses an outdoor area often enough that losing it to the weather is a real cost. If your space already has a solid roof over it, a fixed awning or blind may suit better.</w:t>
-      </w:r>
-    </w:p>
-    <w:p>
-      <w:pPr>
-        <w:spacing w:before="160" w:after="40"/>
-      </w:pPr>
-      <w:r>
-        <w:rPr>
-          <w:b/>
-          <w:color w:val="888888"/>
-        </w:rPr>
-        <w:t xml:space="preserve">H2: </w:t>
-      </w:r>
-      <w:r>
-        <w:rPr>
-          <w:b/>
-        </w:rPr>
         <w:t>Common questions about retractable roofs</w:t>
       </w:r>
     </w:p>
@@ -2119,6 +2119,32 @@
         <w:rPr>
           <w:b/>
         </w:rPr>
+        <w:t>Who the Delta Commercial Folding Arm suits</w:t>
+      </w:r>
+    </w:p>
+    <w:p>
+      <w:r>
+        <w:rPr>
+          <w:b w:val="0"/>
+        </w:rPr>
+        <w:t>The Delta Commercial Folding Arm suits buyers who want a folding-arm awning built to last outdoors rather than the cheapest option on the shelf. The full cassette makes it a strong fit for a cafe or shopfront frontage, a deck exposed to Melbourne's swing from sun to sudden shower, or a home alfresco you want to keep for years. Because it is supplied for you or your contractor to fit, it works for owners comfortable arranging their own installation and keen to avoid a bundled measure-and-install cost. If you want a lightweight, occasional-use patio arm at the lowest price, an open folding arm will be cheaper.</w:t>
+      </w:r>
+    </w:p>
+    <w:p>
+      <w:pPr>
+        <w:spacing w:before="160" w:after="40"/>
+      </w:pPr>
+      <w:r>
+        <w:rPr>
+          <w:b/>
+          <w:color w:val="888888"/>
+        </w:rPr>
+        <w:t xml:space="preserve">H2: </w:t>
+      </w:r>
+      <w:r>
+        <w:rPr>
+          <w:b/>
+        </w:rPr>
         <w:t>Pricing, sizes and how to order</w:t>
       </w:r>
     </w:p>
@@ -2194,32 +2220,6 @@
         <w:rPr>
           <w:b/>
         </w:rPr>
-        <w:t>Who the Delta Commercial Folding Arm suits</w:t>
-      </w:r>
-    </w:p>
-    <w:p>
-      <w:r>
-        <w:rPr>
-          <w:b w:val="0"/>
-        </w:rPr>
-        <w:t>The Delta Commercial Folding Arm suits buyers who want a folding-arm awning built to last outdoors rather than the cheapest option on the shelf. The full cassette makes it a strong fit for a cafe or shopfront frontage, a deck exposed to Melbourne's swing from sun to sudden shower, or a home alfresco you want to keep for years. Because it is supplied for you or your contractor to fit, it works for owners comfortable arranging their own installation and keen to avoid a bundled measure-and-install cost. If you want a lightweight, occasional-use patio arm at the lowest price, an open folding arm will be cheaper.</w:t>
-      </w:r>
-    </w:p>
-    <w:p>
-      <w:pPr>
-        <w:spacing w:before="160" w:after="40"/>
-      </w:pPr>
-      <w:r>
-        <w:rPr>
-          <w:b/>
-          <w:color w:val="888888"/>
-        </w:rPr>
-        <w:t xml:space="preserve">H2: </w:t>
-      </w:r>
-      <w:r>
-        <w:rPr>
-          <w:b/>
-        </w:rPr>
         <w:t>Folding arm awning questions</w:t>
       </w:r>
     </w:p>
@@ -2838,6 +2838,32 @@
         <w:rPr>
           <w:b/>
         </w:rPr>
+        <w:t>Who the Skyflex outdoor TV is best for</w:t>
+      </w:r>
+    </w:p>
+    <w:p>
+      <w:r>
+        <w:rPr>
+          <w:b w:val="0"/>
+        </w:rPr>
+        <w:t>This TV is best for a covered or partly shaded outdoor spot: a roofed alfresco, a verandah, a pergola, or a corner that catches only glancing light. It suits homeowners who already have a shaded entertaining area and want a screen that can stay mounted outside through the seasons. It is not the right choice for a wall in open, direct sun through the middle of the day, where a brighter panel built for full sun performs better. If your spot has something overhead, this is the screen for it.</w:t>
+      </w:r>
+    </w:p>
+    <w:p>
+      <w:pPr>
+        <w:spacing w:before="160" w:after="40"/>
+      </w:pPr>
+      <w:r>
+        <w:rPr>
+          <w:b/>
+          <w:color w:val="888888"/>
+        </w:rPr>
+        <w:t xml:space="preserve">H2: </w:t>
+      </w:r>
+      <w:r>
+        <w:rPr>
+          <w:b/>
+        </w:rPr>
         <w:t>Pricing, sizes and pre-order</w:t>
       </w:r>
     </w:p>
@@ -2928,32 +2954,6 @@
         <w:rPr>
           <w:b/>
         </w:rPr>
-        <w:t>Who the Skyflex outdoor TV is best for</w:t>
-      </w:r>
-    </w:p>
-    <w:p>
-      <w:r>
-        <w:rPr>
-          <w:b w:val="0"/>
-        </w:rPr>
-        <w:t>This TV is best for a covered or partly shaded outdoor spot: a roofed alfresco, a verandah, a pergola, or a corner that catches only glancing light. It suits homeowners who already have a shaded entertaining area and want a screen that can stay mounted outside through the seasons. It is not the right choice for a wall in open, direct sun through the middle of the day, where a brighter panel built for full sun performs better. If your spot has something overhead, this is the screen for it.</w:t>
-      </w:r>
-    </w:p>
-    <w:p>
-      <w:pPr>
-        <w:spacing w:before="160" w:after="40"/>
-      </w:pPr>
-      <w:r>
-        <w:rPr>
-          <w:b/>
-          <w:color w:val="888888"/>
-        </w:rPr>
-        <w:t xml:space="preserve">H2: </w:t>
-      </w:r>
-      <w:r>
-        <w:rPr>
-          <w:b/>
-        </w:rPr>
         <w:t>Questions buyers ask before going outdoors</w:t>
       </w:r>
     </w:p>
@@ -3423,6 +3423,32 @@
         <w:rPr>
           <w:b/>
         </w:rPr>
+        <w:t>Who a Skyflex BBQ pod is for</w:t>
+      </w:r>
+    </w:p>
+    <w:p>
+      <w:r>
+        <w:rPr>
+          <w:b w:val="0"/>
+        </w:rPr>
+        <w:t>A Skyflex BBQ pod is for homeowners and venues planning a premium outdoor kitchen who want it configured to their space rather than bought off a shelf or built bespoke on site. It is a considered purchase settled through a consultation, so it suits buyers who want to tailor the size, finish and fit-out and are comfortable with a made-to-order timeline. If you want the look and function of a custom outdoor kitchen at a lower entry price than a fully bespoke build, this is the route. For a small, off-the-shelf grill on a budget, it is more than you need.</w:t>
+      </w:r>
+    </w:p>
+    <w:p>
+      <w:pPr>
+        <w:spacing w:before="160" w:after="40"/>
+      </w:pPr>
+      <w:r>
+        <w:rPr>
+          <w:b/>
+          <w:color w:val="888888"/>
+        </w:rPr>
+        <w:t xml:space="preserve">H2: </w:t>
+      </w:r>
+      <w:r>
+        <w:rPr>
+          <w:b/>
+        </w:rPr>
         <w:t>What you are buying, and how these BBQ pods compare</w:t>
       </w:r>
     </w:p>
@@ -3498,32 +3524,6 @@
         <w:rPr>
           <w:b/>
         </w:rPr>
-        <w:t>Who a Skyflex BBQ pod is for</w:t>
-      </w:r>
-    </w:p>
-    <w:p>
-      <w:r>
-        <w:rPr>
-          <w:b w:val="0"/>
-        </w:rPr>
-        <w:t>A Skyflex BBQ pod is for homeowners and venues planning a premium outdoor kitchen who want it configured to their space rather than bought off a shelf or built bespoke on site. It is a considered purchase settled through a consultation, so it suits buyers who want to tailor the size, finish and fit-out and are comfortable with a made-to-order timeline. If you want the look and function of a custom outdoor kitchen at a lower entry price than a fully bespoke build, this is the route. For a small, off-the-shelf grill on a budget, it is more than you need.</w:t>
-      </w:r>
-    </w:p>
-    <w:p>
-      <w:pPr>
-        <w:spacing w:before="160" w:after="40"/>
-      </w:pPr>
-      <w:r>
-        <w:rPr>
-          <w:b/>
-          <w:color w:val="888888"/>
-        </w:rPr>
-        <w:t xml:space="preserve">H2: </w:t>
-      </w:r>
-      <w:r>
-        <w:rPr>
-          <w:b/>
-        </w:rPr>
         <w:t>BBQ pod questions</w:t>
       </w:r>
     </w:p>
@@ -4121,7 +4121,7 @@
         <w:rPr>
           <w:b/>
         </w:rPr>
-        <w:t>About Skyflex</w:t>
+        <w:t>Who a smart toilet is best for</w:t>
       </w:r>
     </w:p>
     <w:p>
@@ -4129,7 +4129,7 @@
         <w:rPr>
           <w:b w:val="0"/>
         </w:rPr>
-        <w:t>Skyflex was founded in 2023 by Christopher Mitsopoulos and is based in Melbourne, working with homeowners and businesses across the city and in Sydney. The core of the business is outdoor living, and smart toilets are a category we have added to that range, so we will be straight with you: we are not a decades-old bathroom specialist, and this page reflects that. What we can point to is a customer base that has grown past 100, with about half of all new business coming through referrals from people who bought from us and told someone else. Our showroom is in Epping and open by appointment, and the same team that answers the phone handles your enquiry from the first question to delivery.</w:t>
+        <w:t>A smart toilet is best for buyers who value the daily comfort of a warm seat, a warm-water wash and a dryer, and who are renovating or building where the plumbing and a power point can be planned in. The U6 and U7 suit a household happy to add an electrical outlet near the pan if there is not one already. It is less suited to anyone unwilling to run power to the toilet, or who does not want the extra electronic parts to maintain over the years. If the wash and warm seat appeal and the bathroom can take a power point, the value follows.</w:t>
       </w:r>
     </w:p>
     <w:p>
@@ -4147,7 +4147,7 @@
         <w:rPr>
           <w:b/>
         </w:rPr>
-        <w:t>Who a smart toilet is best for</w:t>
+        <w:t>About Skyflex</w:t>
       </w:r>
     </w:p>
     <w:p>
@@ -4155,7 +4155,7 @@
         <w:rPr>
           <w:b w:val="0"/>
         </w:rPr>
-        <w:t>A smart toilet is best for buyers who value the daily comfort of a warm seat, a warm-water wash and a dryer, and who are renovating or building where the plumbing and a power point can be planned in. The U6 and U7 suit a household happy to add an electrical outlet near the pan if there is not one already. It is less suited to anyone unwilling to run power to the toilet, or who does not want the extra electronic parts to maintain over the years. If the wash and warm seat appeal and the bathroom can take a power point, the value follows.</w:t>
+        <w:t>Skyflex was founded in 2023 by Christopher Mitsopoulos and is based in Melbourne, working with homeowners and businesses across the city and in Sydney. The core of the business is outdoor living, and smart toilets are a category we have added to that range, so we will be straight with you: we are not a decades-old bathroom specialist, and this page reflects that. What we can point to is a customer base that has grown past 100, with about half of all new business coming through referrals from people who bought from us and told someone else. Our showroom is in Epping and open by appointment, and the same team that answers the phone handles your enquiry from the first question to delivery.</w:t>
       </w:r>
     </w:p>
     <w:p>

</xml_diff>

<commit_message>
skyflex.au — fix BBQ pod dimensions per client spec: 2200w x 2300h x 770w -> 2200W x 2300H x 720D (both sizes, 3 occurrences); root cause was the live product page which still shows the wrong 770/double-w and needs the same correction; bbq re-approved, deliverables rebuilt
</commit_message>
<xml_diff>
--- a/clients/skyflex.au/content/exports/delivery-2026-07-16T05-22/skyflex-content-deliverable.docx
+++ b/clients/skyflex.au/content/exports/delivery-2026-07-16T05-22/skyflex-content-deliverable.docx
@@ -3369,7 +3369,7 @@
         <w:rPr>
           <w:b w:val="0"/>
         </w:rPr>
-        <w:t>2200w x 2300h x 770w: the compact unit, suited to a courtyard, a smaller deck, or a tighter alfresco corner</w:t>
+        <w:t>2200W x 2300H x 720D: the compact unit, suited to a courtyard, a smaller deck, or a tighter alfresco corner</w:t>
       </w:r>
     </w:p>
     <w:p>
@@ -3380,7 +3380,7 @@
         <w:rPr>
           <w:b w:val="0"/>
         </w:rPr>
-        <w:t>2850w x 2300h x 770w: the wider unit, giving more bench and cooking space along the run</w:t>
+        <w:t>2850W x 2300H x 720D: the wider unit, giving more bench and cooking space along the run</w:t>
       </w:r>
     </w:p>
     <w:p>
@@ -3602,7 +3602,7 @@
         <w:rPr>
           <w:b w:val="0"/>
         </w:rPr>
-        <w:t>Two footprints, both standing 2.3 metres tall: 2200w x 2300h x 770w for a courtyard or a tighter alfresco corner, and 2850w x 2300h x 770w for a larger space.</w:t>
+        <w:t>Two footprints, both standing 2.3 metres tall: 2200W x 2300H x 720D for a courtyard or a tighter alfresco corner, and 2850W x 2300H x 720D for a larger space.</w:t>
       </w:r>
     </w:p>
     <w:p>

</xml_diff>